<commit_message>
a more detailed text test
</commit_message>
<xml_diff>
--- a/tests/02_basetest/docx_basic/text/template.docx
+++ b/tests/02_basetest/docx_basic/text/template.docx
@@ -1,6 +1,6 @@
 
 <file path=word/document.xml><?xml version="1.0" encoding="utf-8"?>
-<w:document xmlns:wpc="http://schemas.microsoft.com/office/word/2010/wordprocessingCanvas" xmlns:cx="http://schemas.microsoft.com/office/drawing/2014/chartex" xmlns:cx1="http://schemas.microsoft.com/office/drawing/2015/9/8/chartex" xmlns:cx2="http://schemas.microsoft.com/office/drawing/2015/10/21/chartex" xmlns:cx3="http://schemas.microsoft.com/office/drawing/2016/5/9/chartex" xmlns:cx4="http://schemas.microsoft.com/office/drawing/2016/5/10/chartex" xmlns:cx5="http://schemas.microsoft.com/office/drawing/2016/5/11/chartex" xmlns:cx6="http://schemas.microsoft.com/office/drawing/2016/5/12/chartex" xmlns:cx7="http://schemas.microsoft.com/office/drawing/2016/5/13/chartex" xmlns:cx8="http://schemas.microsoft.com/office/drawing/2016/5/14/chartex" xmlns:mc="http://schemas.openxmlformats.org/markup-compatibility/2006" xmlns:aink="http://schemas.microsoft.com/office/drawing/2016/ink" xmlns:am3d="http://schemas.microsoft.com/office/drawing/2017/model3d" xmlns:o="urn:schemas-microsoft-com:office:office" xmlns:r="http://schemas.openxmlformats.org/officeDocument/2006/relationships" xmlns:m="http://schemas.openxmlformats.org/officeDocument/2006/math" xmlns:v="urn:schemas-microsoft-com:vml" xmlns:wp14="http://schemas.microsoft.com/office/word/2010/wordprocessingDrawing" xmlns:wp="http://schemas.openxmlformats.org/drawingml/2006/wordprocessingDrawing" xmlns:w10="urn:schemas-microsoft-com:office:word" xmlns:w="http://schemas.openxmlformats.org/wordprocessingml/2006/main" xmlns:w14="http://schemas.microsoft.com/office/word/2010/wordml" xmlns:w15="http://schemas.microsoft.com/office/word/2012/wordml" xmlns:w16cex="http://schemas.microsoft.com/office/word/2018/wordml/cex" xmlns:w16cid="http://schemas.microsoft.com/office/word/2016/wordml/cid" xmlns:w16="http://schemas.microsoft.com/office/word/2018/wordml" xmlns:w16sdtdh="http://schemas.microsoft.com/office/word/2020/wordml/sdtdatahash" xmlns:w16se="http://schemas.microsoft.com/office/word/2015/wordml/symex" xmlns:wpg="http://schemas.microsoft.com/office/word/2010/wordprocessingGroup" xmlns:wpi="http://schemas.microsoft.com/office/word/2010/wordprocessingInk" xmlns:wne="http://schemas.microsoft.com/office/word/2006/wordml" xmlns:wps="http://schemas.microsoft.com/office/word/2010/wordprocessingShape" mc:Ignorable="w14 w15 w16se w16cid w16 w16cex w16sdtdh wp14">
+<w:document xmlns:wpc="http://schemas.microsoft.com/office/word/2010/wordprocessingCanvas" xmlns:cx="http://schemas.microsoft.com/office/drawing/2014/chartex" xmlns:cx1="http://schemas.microsoft.com/office/drawing/2015/9/8/chartex" xmlns:cx2="http://schemas.microsoft.com/office/drawing/2015/10/21/chartex" xmlns:cx3="http://schemas.microsoft.com/office/drawing/2016/5/9/chartex" xmlns:cx4="http://schemas.microsoft.com/office/drawing/2016/5/10/chartex" xmlns:cx5="http://schemas.microsoft.com/office/drawing/2016/5/11/chartex" xmlns:cx6="http://schemas.microsoft.com/office/drawing/2016/5/12/chartex" xmlns:cx7="http://schemas.microsoft.com/office/drawing/2016/5/13/chartex" xmlns:cx8="http://schemas.microsoft.com/office/drawing/2016/5/14/chartex" xmlns:mc="http://schemas.openxmlformats.org/markup-compatibility/2006" xmlns:aink="http://schemas.microsoft.com/office/drawing/2016/ink" xmlns:am3d="http://schemas.microsoft.com/office/drawing/2017/model3d" xmlns:o="urn:schemas-microsoft-com:office:office" xmlns:oel="http://schemas.microsoft.com/office/2019/extlst" xmlns:r="http://schemas.openxmlformats.org/officeDocument/2006/relationships" xmlns:m="http://schemas.openxmlformats.org/officeDocument/2006/math" xmlns:v="urn:schemas-microsoft-com:vml" xmlns:wp14="http://schemas.microsoft.com/office/word/2010/wordprocessingDrawing" xmlns:wp="http://schemas.openxmlformats.org/drawingml/2006/wordprocessingDrawing" xmlns:w10="urn:schemas-microsoft-com:office:word" xmlns:w="http://schemas.openxmlformats.org/wordprocessingml/2006/main" xmlns:w14="http://schemas.microsoft.com/office/word/2010/wordml" xmlns:w15="http://schemas.microsoft.com/office/word/2012/wordml" xmlns:w16cex="http://schemas.microsoft.com/office/word/2018/wordml/cex" xmlns:w16cid="http://schemas.microsoft.com/office/word/2016/wordml/cid" xmlns:w16="http://schemas.microsoft.com/office/word/2018/wordml" xmlns:w16sdtdh="http://schemas.microsoft.com/office/word/2020/wordml/sdtdatahash" xmlns:w16se="http://schemas.microsoft.com/office/word/2015/wordml/symex" xmlns:wpg="http://schemas.microsoft.com/office/word/2010/wordprocessingGroup" xmlns:wpi="http://schemas.microsoft.com/office/word/2010/wordprocessingInk" xmlns:wne="http://schemas.microsoft.com/office/word/2006/wordml" xmlns:wps="http://schemas.microsoft.com/office/word/2010/wordprocessingShape" mc:Ignorable="w14 w15 w16se w16cid w16 w16cex w16sdtdh wp14">
   <w:body>
     <w:p>
       <w:pPr>
@@ -17,7 +17,6 @@
         <w:t>&lt;</w:t>
       </w:r>
       <w:proofErr w:type="spellStart"/>
-      <w:proofErr w:type="gramStart"/>
       <w:r>
         <w:rPr>
           <w:lang w:val="en-US"/>
@@ -31,7 +30,6 @@
         <w:t>title</w:t>
       </w:r>
       <w:proofErr w:type="spellEnd"/>
-      <w:proofErr w:type="gramEnd"/>
       <w:r>
         <w:rPr>
           <w:lang w:val="en-US"/>
@@ -42,6 +40,18 @@
         <w:rPr>
           <w:lang w:val="en-US"/>
         </w:rPr>
+        <w:t>SECTION</w:t>
+      </w:r>
+      <w:r>
+        <w:rPr>
+          <w:lang w:val="en-US"/>
+        </w:rPr>
+        <w:t xml:space="preserve"> </w:t>
+      </w:r>
+      <w:r>
+        <w:rPr>
+          <w:lang w:val="en-US"/>
+        </w:rPr>
         <w:t>TITLE</w:t>
       </w:r>
     </w:p>
@@ -49,12 +59,14 @@
       <w:pPr>
         <w:pStyle w:val="Heading3"/>
         <w:rPr>
+          <w:color w:val="2E74B5" w:themeColor="accent1" w:themeShade="BF"/>
           <w:lang w:val="en-US"/>
         </w:rPr>
       </w:pPr>
       <w:bookmarkStart w:id="0" w:name="_Toc46267016"/>
       <w:r>
         <w:rPr>
+          <w:color w:val="2E74B5" w:themeColor="accent1" w:themeShade="BF"/>
           <w:lang w:val="en-US"/>
         </w:rPr>
         <w:t>When and who?</w:t>
@@ -63,27 +75,29 @@
     <w:p>
       <w:pPr>
         <w:rPr>
-          <w:lang w:val="en-US"/>
-        </w:rPr>
-      </w:pPr>
-      <w:r>
-        <w:rPr>
+          <w:color w:val="2E74B5" w:themeColor="accent1" w:themeShade="BF"/>
+          <w:lang w:val="en-US"/>
+        </w:rPr>
+      </w:pPr>
+      <w:r>
+        <w:rPr>
+          <w:color w:val="2E74B5" w:themeColor="accent1" w:themeShade="BF"/>
           <w:lang w:val="en-US"/>
         </w:rPr>
         <w:t>&lt;</w:t>
       </w:r>
       <w:proofErr w:type="spellStart"/>
-      <w:proofErr w:type="gramStart"/>
-      <w:r>
-        <w:rPr>
+      <w:r>
+        <w:rPr>
+          <w:color w:val="2E74B5" w:themeColor="accent1" w:themeShade="BF"/>
           <w:lang w:val="en-US"/>
         </w:rPr>
         <w:t>date:creation</w:t>
       </w:r>
       <w:proofErr w:type="spellEnd"/>
-      <w:proofErr w:type="gramEnd"/>
-      <w:r>
-        <w:rPr>
+      <w:r>
+        <w:rPr>
+          <w:color w:val="2E74B5" w:themeColor="accent1" w:themeShade="BF"/>
           <w:lang w:val="en-US"/>
         </w:rPr>
         <w:t>/&gt; by &lt;author/&gt;</w:t>
@@ -92,27 +106,36 @@
     <w:p>
       <w:pPr>
         <w:rPr>
-          <w:lang w:val="en-US"/>
-        </w:rPr>
-      </w:pPr>
-      <w:r>
-        <w:rPr>
+          <w:color w:val="2E74B5" w:themeColor="accent1" w:themeShade="BF"/>
+          <w:lang w:val="en-US"/>
+        </w:rPr>
+      </w:pPr>
+      <w:r>
+        <w:rPr>
+          <w:color w:val="2E74B5" w:themeColor="accent1" w:themeShade="BF"/>
+          <w:lang w:val="en-US"/>
+        </w:rPr>
+        <w:t xml:space="preserve">Version: </w:t>
+      </w:r>
+      <w:r>
+        <w:rPr>
+          <w:color w:val="2E74B5" w:themeColor="accent1" w:themeShade="BF"/>
           <w:lang w:val="en-US"/>
         </w:rPr>
         <w:t>&lt;</w:t>
       </w:r>
       <w:proofErr w:type="spellStart"/>
-      <w:proofErr w:type="gramStart"/>
-      <w:r>
-        <w:rPr>
+      <w:r>
+        <w:rPr>
+          <w:color w:val="2E74B5" w:themeColor="accent1" w:themeShade="BF"/>
           <w:lang w:val="en-US"/>
         </w:rPr>
         <w:t>report:version</w:t>
       </w:r>
       <w:proofErr w:type="spellEnd"/>
-      <w:proofErr w:type="gramEnd"/>
-      <w:r>
-        <w:rPr>
+      <w:r>
+        <w:rPr>
+          <w:color w:val="2E74B5" w:themeColor="accent1" w:themeShade="BF"/>
           <w:lang w:val="en-US"/>
         </w:rPr>
         <w:t>/&gt;</w:t>
@@ -121,27 +144,36 @@
     <w:p>
       <w:pPr>
         <w:rPr>
-          <w:lang w:val="en-US"/>
-        </w:rPr>
-      </w:pPr>
-      <w:r>
-        <w:rPr>
+          <w:color w:val="2E74B5" w:themeColor="accent1" w:themeShade="BF"/>
+          <w:lang w:val="en-US"/>
+        </w:rPr>
+      </w:pPr>
+      <w:r>
+        <w:rPr>
+          <w:color w:val="2E74B5" w:themeColor="accent1" w:themeShade="BF"/>
+          <w:lang w:val="en-US"/>
+        </w:rPr>
+        <w:t xml:space="preserve">Status: </w:t>
+      </w:r>
+      <w:r>
+        <w:rPr>
+          <w:color w:val="2E74B5" w:themeColor="accent1" w:themeShade="BF"/>
           <w:lang w:val="en-US"/>
         </w:rPr>
         <w:t>&lt;</w:t>
       </w:r>
       <w:proofErr w:type="spellStart"/>
-      <w:proofErr w:type="gramStart"/>
-      <w:r>
-        <w:rPr>
+      <w:r>
+        <w:rPr>
+          <w:color w:val="2E74B5" w:themeColor="accent1" w:themeShade="BF"/>
           <w:lang w:val="en-US"/>
         </w:rPr>
         <w:t>report:status</w:t>
       </w:r>
       <w:proofErr w:type="spellEnd"/>
-      <w:proofErr w:type="gramEnd"/>
-      <w:r>
-        <w:rPr>
+      <w:r>
+        <w:rPr>
+          <w:color w:val="2E74B5" w:themeColor="accent1" w:themeShade="BF"/>
           <w:lang w:val="en-US"/>
         </w:rPr>
         <w:t>/&gt;</w:t>
@@ -152,11 +184,13 @@
       <w:pPr>
         <w:pStyle w:val="Heading3"/>
         <w:rPr>
-          <w:lang w:val="en-US"/>
-        </w:rPr>
-      </w:pPr>
-      <w:r>
-        <w:rPr>
+          <w:color w:val="2E74B5" w:themeColor="accent1" w:themeShade="BF"/>
+          <w:lang w:val="en-US"/>
+        </w:rPr>
+      </w:pPr>
+      <w:r>
+        <w:rPr>
+          <w:color w:val="2E74B5" w:themeColor="accent1" w:themeShade="BF"/>
           <w:lang w:val="en-US"/>
         </w:rPr>
         <w:t>What?</w:t>
@@ -165,27 +199,44 @@
     <w:p>
       <w:pPr>
         <w:rPr>
-          <w:lang w:val="en-US"/>
-        </w:rPr>
-      </w:pPr>
-      <w:r>
-        <w:rPr>
+          <w:color w:val="2E74B5" w:themeColor="accent1" w:themeShade="BF"/>
+          <w:lang w:val="en-US"/>
+        </w:rPr>
+      </w:pPr>
+      <w:r>
+        <w:rPr>
+          <w:color w:val="2E74B5" w:themeColor="accent1" w:themeShade="BF"/>
+          <w:lang w:val="en-US"/>
+        </w:rPr>
+        <w:t>Description goes here:</w:t>
+      </w:r>
+    </w:p>
+    <w:p>
+      <w:pPr>
+        <w:rPr>
+          <w:color w:val="2E74B5" w:themeColor="accent1" w:themeShade="BF"/>
+          <w:lang w:val="en-US"/>
+        </w:rPr>
+      </w:pPr>
+      <w:r>
+        <w:rPr>
+          <w:color w:val="2E74B5" w:themeColor="accent1" w:themeShade="BF"/>
           <w:lang w:val="en-US"/>
         </w:rPr>
         <w:t>&lt;</w:t>
       </w:r>
       <w:proofErr w:type="spellStart"/>
-      <w:proofErr w:type="gramStart"/>
-      <w:r>
-        <w:rPr>
+      <w:r>
+        <w:rPr>
+          <w:color w:val="2E74B5" w:themeColor="accent1" w:themeShade="BF"/>
           <w:lang w:val="en-US"/>
         </w:rPr>
         <w:t>text:description</w:t>
       </w:r>
       <w:proofErr w:type="spellEnd"/>
-      <w:proofErr w:type="gramEnd"/>
-      <w:r>
-        <w:rPr>
+      <w:r>
+        <w:rPr>
+          <w:color w:val="2E74B5" w:themeColor="accent1" w:themeShade="BF"/>
           <w:lang w:val="en-US"/>
         </w:rPr>
         <w:t>/&gt;</w:t>
@@ -194,27 +245,44 @@
     <w:p>
       <w:pPr>
         <w:rPr>
-          <w:lang w:val="en-US"/>
-        </w:rPr>
-      </w:pPr>
-      <w:r>
-        <w:rPr>
+          <w:color w:val="2E74B5" w:themeColor="accent1" w:themeShade="BF"/>
+          <w:lang w:val="en-US"/>
+        </w:rPr>
+      </w:pPr>
+      <w:r>
+        <w:rPr>
+          <w:color w:val="2E74B5" w:themeColor="accent1" w:themeShade="BF"/>
+          <w:lang w:val="en-US"/>
+        </w:rPr>
+        <w:t>Here is a marker:</w:t>
+      </w:r>
+    </w:p>
+    <w:p>
+      <w:pPr>
+        <w:rPr>
+          <w:color w:val="2E74B5" w:themeColor="accent1" w:themeShade="BF"/>
+          <w:lang w:val="en-US"/>
+        </w:rPr>
+      </w:pPr>
+      <w:r>
+        <w:rPr>
+          <w:color w:val="2E74B5" w:themeColor="accent1" w:themeShade="BF"/>
           <w:lang w:val="en-US"/>
         </w:rPr>
         <w:t>&lt;</w:t>
       </w:r>
       <w:proofErr w:type="spellStart"/>
-      <w:proofErr w:type="gramStart"/>
-      <w:r>
-        <w:rPr>
+      <w:r>
+        <w:rPr>
+          <w:color w:val="2E74B5" w:themeColor="accent1" w:themeShade="BF"/>
           <w:lang w:val="en-US"/>
         </w:rPr>
         <w:t>marker:content</w:t>
       </w:r>
       <w:proofErr w:type="spellEnd"/>
-      <w:proofErr w:type="gramEnd"/>
-      <w:r>
-        <w:rPr>
+      <w:r>
+        <w:rPr>
+          <w:color w:val="2E74B5" w:themeColor="accent1" w:themeShade="BF"/>
           <w:lang w:val="en-US"/>
         </w:rPr>
         <w:t>/&gt;</w:t>
@@ -225,6 +293,7 @@
         <w:rPr>
           <w:i/>
           <w:iCs/>
+          <w:color w:val="2E74B5" w:themeColor="accent1" w:themeShade="BF"/>
           <w:lang w:val="en-US"/>
         </w:rPr>
       </w:pPr>
@@ -232,26 +301,27 @@
         <w:rPr>
           <w:i/>
           <w:iCs/>
+          <w:color w:val="2E74B5" w:themeColor="accent1" w:themeShade="BF"/>
           <w:lang w:val="en-US"/>
         </w:rPr>
         <w:t>Date published: &lt;</w:t>
       </w:r>
       <w:proofErr w:type="spellStart"/>
-      <w:proofErr w:type="gramStart"/>
       <w:r>
         <w:rPr>
           <w:i/>
           <w:iCs/>
+          <w:color w:val="2E74B5" w:themeColor="accent1" w:themeShade="BF"/>
           <w:lang w:val="en-US"/>
         </w:rPr>
         <w:t>date:published</w:t>
       </w:r>
       <w:proofErr w:type="spellEnd"/>
-      <w:proofErr w:type="gramEnd"/>
       <w:r>
         <w:rPr>
           <w:i/>
           <w:iCs/>
+          <w:color w:val="2E74B5" w:themeColor="accent1" w:themeShade="BF"/>
           <w:lang w:val="en-US"/>
         </w:rPr>
         <w:t>/&gt;</w:t>
@@ -260,6 +330,7 @@
     <w:p>
       <w:pPr>
         <w:rPr>
+          <w:color w:val="2E74B5" w:themeColor="accent1" w:themeShade="BF"/>
           <w:lang w:val="en-US"/>
         </w:rPr>
         <w:sectPr>
@@ -273,34 +344,37 @@
       </w:pPr>
       <w:r>
         <w:rPr>
+          <w:color w:val="2E74B5" w:themeColor="accent1" w:themeShade="BF"/>
+          <w:lang w:val="en-US"/>
+        </w:rPr>
+        <w:t>END OF TITLE SECTION</w:t>
+      </w:r>
+      <w:r>
+        <w:rPr>
+          <w:color w:val="2E74B5" w:themeColor="accent1" w:themeShade="BF"/>
           <w:lang w:val="en-US"/>
         </w:rPr>
         <w:t>&lt;</w:t>
       </w:r>
       <w:r>
         <w:rPr>
+          <w:color w:val="2E74B5" w:themeColor="accent1" w:themeShade="BF"/>
           <w:lang w:val="en-US"/>
         </w:rPr>
         <w:t>/</w:t>
       </w:r>
       <w:proofErr w:type="spellStart"/>
-      <w:proofErr w:type="gramStart"/>
-      <w:r>
-        <w:rPr>
-          <w:lang w:val="en-US"/>
-        </w:rPr>
-        <w:t>section:</w:t>
-      </w:r>
-      <w:r>
-        <w:rPr>
-          <w:lang w:val="en-US"/>
-        </w:rPr>
-        <w:t>title</w:t>
+      <w:r>
+        <w:rPr>
+          <w:color w:val="2E74B5" w:themeColor="accent1" w:themeShade="BF"/>
+          <w:lang w:val="en-US"/>
+        </w:rPr>
+        <w:t>section:title</w:t>
       </w:r>
       <w:proofErr w:type="spellEnd"/>
-      <w:proofErr w:type="gramEnd"/>
-      <w:r>
-        <w:rPr>
+      <w:r>
+        <w:rPr>
+          <w:color w:val="2E74B5" w:themeColor="accent1" w:themeShade="BF"/>
           <w:lang w:val="en-US"/>
         </w:rPr>
         <w:t>&gt;</w:t>
@@ -323,7 +397,6 @@
         <w:t>&lt;</w:t>
       </w:r>
       <w:proofErr w:type="spellStart"/>
-      <w:proofErr w:type="gramStart"/>
       <w:r>
         <w:rPr>
           <w:color w:val="00B0F0"/>
@@ -332,7 +405,6 @@
         <w:t>section:second</w:t>
       </w:r>
       <w:proofErr w:type="spellEnd"/>
-      <w:proofErr w:type="gramEnd"/>
       <w:r>
         <w:rPr>
           <w:color w:val="00B0F0"/>
@@ -347,23 +419,44 @@
         </w:rPr>
         <w:t>SECOND</w:t>
       </w:r>
-    </w:p>
-    <w:p>
-      <w:pPr>
+      <w:r>
         <w:rPr>
           <w:color w:val="00B0F0"/>
           <w:lang w:val="en-US"/>
         </w:rPr>
-      </w:pPr>
-      <w:r>
+        <w:t xml:space="preserve"> SECTION</w:t>
+      </w:r>
+    </w:p>
+    <w:p>
+      <w:pPr>
         <w:rPr>
           <w:color w:val="00B0F0"/>
           <w:lang w:val="en-US"/>
         </w:rPr>
+      </w:pPr>
+      <w:r>
+        <w:rPr>
+          <w:color w:val="00B0F0"/>
+          <w:lang w:val="en-US"/>
+        </w:rPr>
+        <w:t xml:space="preserve">Description goes here: </w:t>
+      </w:r>
+    </w:p>
+    <w:p>
+      <w:pPr>
+        <w:rPr>
+          <w:color w:val="00B0F0"/>
+          <w:lang w:val="en-US"/>
+        </w:rPr>
+      </w:pPr>
+      <w:r>
+        <w:rPr>
+          <w:color w:val="00B0F0"/>
+          <w:lang w:val="en-US"/>
+        </w:rPr>
         <w:t>&lt;</w:t>
       </w:r>
       <w:proofErr w:type="spellStart"/>
-      <w:proofErr w:type="gramStart"/>
       <w:r>
         <w:rPr>
           <w:color w:val="00B0F0"/>
@@ -372,7 +465,6 @@
         <w:t>text:description</w:t>
       </w:r>
       <w:proofErr w:type="spellEnd"/>
-      <w:proofErr w:type="gramEnd"/>
       <w:r>
         <w:rPr>
           <w:color w:val="00B0F0"/>
@@ -399,6 +491,7 @@
     <w:p>
       <w:pPr>
         <w:pStyle w:val="Heading2"/>
+        <w:ind w:left="708"/>
         <w:rPr>
           <w:color w:val="FF0000"/>
           <w:lang w:val="en-US"/>
@@ -412,16 +505,28 @@
         <w:t>&lt;</w:t>
       </w:r>
       <w:proofErr w:type="spellStart"/>
-      <w:proofErr w:type="gramStart"/>
       <w:r>
         <w:rPr>
           <w:color w:val="FF0000"/>
           <w:lang w:val="en-US"/>
         </w:rPr>
-        <w:t>subsection:seconda</w:t>
+        <w:t>subsection:second</w:t>
+      </w:r>
+      <w:r>
+        <w:rPr>
+          <w:color w:val="FF0000"/>
+          <w:lang w:val="en-US"/>
+        </w:rPr>
+        <w:t>sub</w:t>
+      </w:r>
+      <w:r>
+        <w:rPr>
+          <w:color w:val="FF0000"/>
+          <w:lang w:val="en-US"/>
+        </w:rPr>
+        <w:t>a</w:t>
       </w:r>
       <w:proofErr w:type="spellEnd"/>
-      <w:proofErr w:type="gramEnd"/>
       <w:r>
         <w:rPr>
           <w:color w:val="FF0000"/>
@@ -434,25 +539,53 @@
           <w:color w:val="FF0000"/>
           <w:lang w:val="en-US"/>
         </w:rPr>
-        <w:t>&gt;&lt;head/&gt;</w:t>
-      </w:r>
-    </w:p>
-    <w:p>
-      <w:pPr>
+        <w:t>&gt;</w:t>
+      </w:r>
+      <w:r>
         <w:rPr>
           <w:color w:val="FF0000"/>
           <w:lang w:val="en-US"/>
         </w:rPr>
-      </w:pPr>
+        <w:t xml:space="preserve"> - </w:t>
+      </w:r>
       <w:r>
         <w:rPr>
           <w:color w:val="FF0000"/>
           <w:lang w:val="en-US"/>
         </w:rPr>
+        <w:t xml:space="preserve">SUB SECONDA - </w:t>
+      </w:r>
+      <w:r>
+        <w:rPr>
+          <w:color w:val="FF0000"/>
+          <w:lang w:val="en-US"/>
+        </w:rPr>
+        <w:t>&lt;head/&gt;</w:t>
+      </w:r>
+    </w:p>
+    <w:p>
+      <w:pPr>
+        <w:ind w:left="708"/>
+        <w:rPr>
+          <w:color w:val="FF0000"/>
+          <w:lang w:val="en-US"/>
+        </w:rPr>
+      </w:pPr>
+      <w:r>
+        <w:rPr>
+          <w:color w:val="FF0000"/>
+          <w:lang w:val="en-US"/>
+        </w:rPr>
+        <w:t xml:space="preserve">DESC: </w:t>
+      </w:r>
+      <w:r>
+        <w:rPr>
+          <w:color w:val="FF0000"/>
+          <w:lang w:val="en-US"/>
+        </w:rPr>
         <w:t>&lt;</w:t>
       </w:r>
       <w:proofErr w:type="spellStart"/>
-      <w:proofErr w:type="gramStart"/>
       <w:r>
         <w:rPr>
           <w:color w:val="FF0000"/>
@@ -461,7 +594,6 @@
         <w:t>text:description</w:t>
       </w:r>
       <w:proofErr w:type="spellEnd"/>
-      <w:proofErr w:type="gramEnd"/>
       <w:r>
         <w:rPr>
           <w:color w:val="FF0000"/>
@@ -473,87 +605,130 @@
     <w:p>
       <w:pPr>
         <w:pStyle w:val="Heading3"/>
-        <w:rPr>
-          <w:lang w:val="en-US"/>
-        </w:rPr>
-      </w:pPr>
-      <w:r>
-        <w:rPr>
+        <w:ind w:left="1416"/>
+        <w:rPr>
+          <w:color w:val="385623" w:themeColor="accent6" w:themeShade="80"/>
+          <w:lang w:val="en-US"/>
+        </w:rPr>
+      </w:pPr>
+      <w:r>
+        <w:rPr>
+          <w:color w:val="385623" w:themeColor="accent6" w:themeShade="80"/>
+          <w:lang w:val="en-US"/>
+        </w:rPr>
+        <w:t>&lt;subsubsection:secondsub</w:t>
+      </w:r>
+      <w:r>
+        <w:rPr>
+          <w:color w:val="385623" w:themeColor="accent6" w:themeShade="80"/>
+          <w:lang w:val="en-US"/>
+        </w:rPr>
+        <w:t>sub</w:t>
+      </w:r>
+      <w:r>
+        <w:rPr>
+          <w:color w:val="385623" w:themeColor="accent6" w:themeShade="80"/>
+          <w:lang w:val="en-US"/>
+        </w:rPr>
+        <w:t>1 template&gt;</w:t>
+      </w:r>
+      <w:r>
+        <w:rPr>
+          <w:color w:val="385623" w:themeColor="accent6" w:themeShade="80"/>
+          <w:lang w:val="en-US"/>
+        </w:rPr>
+        <w:t>SUBSUB seconds</w:t>
+      </w:r>
+      <w:r>
+        <w:rPr>
+          <w:color w:val="385623" w:themeColor="accent6" w:themeShade="80"/>
+          <w:lang w:val="en-US"/>
+        </w:rPr>
+        <w:t>ubs</w:t>
+      </w:r>
+      <w:r>
+        <w:rPr>
+          <w:color w:val="385623" w:themeColor="accent6" w:themeShade="80"/>
+          <w:lang w:val="en-US"/>
+        </w:rPr>
+        <w:t>ub1</w:t>
+      </w:r>
+      <w:r>
+        <w:rPr>
+          <w:color w:val="385623" w:themeColor="accent6" w:themeShade="80"/>
+          <w:lang w:val="en-US"/>
+        </w:rPr>
+        <w:t>&lt;item/&gt;</w:t>
+      </w:r>
+    </w:p>
+    <w:p>
+      <w:pPr>
+        <w:pStyle w:val="Heading4"/>
+        <w:ind w:left="2124"/>
+        <w:rPr>
+          <w:color w:val="C45911" w:themeColor="accent2" w:themeShade="BF"/>
+          <w:lang w:val="en-US"/>
+        </w:rPr>
+      </w:pPr>
+      <w:r>
+        <w:rPr>
+          <w:color w:val="C45911" w:themeColor="accent2" w:themeShade="BF"/>
+          <w:lang w:val="en-US"/>
+        </w:rPr>
+        <w:t>&lt;sub3section:secondsub</w:t>
+      </w:r>
+      <w:r>
+        <w:rPr>
+          <w:color w:val="C45911" w:themeColor="accent2" w:themeShade="BF"/>
+          <w:lang w:val="en-US"/>
+        </w:rPr>
+        <w:t>3</w:t>
+      </w:r>
+      <w:r>
+        <w:rPr>
+          <w:color w:val="C45911" w:themeColor="accent2" w:themeShade="BF"/>
+          <w:lang w:val="en-US"/>
+        </w:rPr>
+        <w:t>i  template&gt;</w:t>
+      </w:r>
+      <w:r>
+        <w:rPr>
+          <w:color w:val="C45911" w:themeColor="accent2" w:themeShade="BF"/>
+          <w:lang w:val="en-US"/>
+        </w:rPr>
+        <w:t>SUB3 secondsub</w:t>
+      </w:r>
+      <w:r>
+        <w:rPr>
+          <w:color w:val="C45911" w:themeColor="accent2" w:themeShade="BF"/>
+          <w:lang w:val="en-US"/>
+        </w:rPr>
+        <w:t>3</w:t>
+      </w:r>
+      <w:r>
+        <w:rPr>
+          <w:color w:val="C45911" w:themeColor="accent2" w:themeShade="BF"/>
+          <w:lang w:val="en-US"/>
+        </w:rPr>
+        <w:t>i</w:t>
+      </w:r>
+      <w:r>
+        <w:rPr>
+          <w:color w:val="C45911" w:themeColor="accent2" w:themeShade="BF"/>
           <w:lang w:val="en-US"/>
         </w:rPr>
         <w:t>&lt;</w:t>
       </w:r>
-      <w:proofErr w:type="gramStart"/>
-      <w:r>
-        <w:rPr>
-          <w:lang w:val="en-US"/>
-        </w:rPr>
-        <w:t>subsubsection:secondsub</w:t>
-      </w:r>
-      <w:proofErr w:type="gramEnd"/>
-      <w:r>
-        <w:rPr>
-          <w:lang w:val="en-US"/>
-        </w:rPr>
-        <w:t>1 template&gt;&lt;item/&gt;</w:t>
-      </w:r>
-    </w:p>
-    <w:p>
-      <w:pPr>
-        <w:rPr>
-          <w:b/>
-          <w:bCs/>
-          <w:color w:val="FF0000"/>
-          <w:lang w:val="en-US"/>
-        </w:rPr>
-      </w:pPr>
-      <w:r>
-        <w:rPr>
-          <w:b/>
-          <w:bCs/>
-          <w:color w:val="FF0000"/>
-          <w:lang w:val="en-US"/>
-        </w:rPr>
-        <w:t>Secondsub1</w:t>
-      </w:r>
-    </w:p>
-    <w:p>
-      <w:pPr>
-        <w:pStyle w:val="Heading4"/>
-        <w:rPr>
-          <w:lang w:val="en-US"/>
-        </w:rPr>
-      </w:pPr>
-      <w:r>
-        <w:rPr>
-          <w:lang w:val="en-US"/>
-        </w:rPr>
-        <w:t>&lt;</w:t>
-      </w:r>
-      <w:proofErr w:type="spellStart"/>
-      <w:proofErr w:type="gramStart"/>
-      <w:r>
-        <w:rPr>
-          <w:lang w:val="en-US"/>
-        </w:rPr>
-        <w:t>sub3section:secondsubsubi</w:t>
-      </w:r>
-      <w:proofErr w:type="spellEnd"/>
-      <w:proofErr w:type="gramEnd"/>
-      <w:r>
-        <w:rPr>
-          <w:lang w:val="en-US"/>
-        </w:rPr>
-        <w:t xml:space="preserve">  template&gt;&lt;</w:t>
-      </w:r>
-      <w:r>
-        <w:rPr>
+      <w:r>
+        <w:rPr>
+          <w:color w:val="C45911" w:themeColor="accent2" w:themeShade="BF"/>
           <w:lang w:val="en-US"/>
         </w:rPr>
         <w:t>subitem</w:t>
       </w:r>
       <w:r>
         <w:rPr>
+          <w:color w:val="C45911" w:themeColor="accent2" w:themeShade="BF"/>
           <w:lang w:val="en-US"/>
         </w:rPr>
         <w:t>/&gt;</w:t>
@@ -561,438 +736,11 @@
     </w:p>
     <w:p>
       <w:pPr>
-        <w:rPr>
-          <w:b/>
-          <w:bCs/>
-          <w:color w:val="FF0000"/>
-          <w:lang w:val="en-US"/>
-        </w:rPr>
-      </w:pPr>
-      <w:proofErr w:type="spellStart"/>
-      <w:r>
-        <w:rPr>
-          <w:b/>
-          <w:bCs/>
-          <w:color w:val="FF0000"/>
-          <w:lang w:val="en-US"/>
-        </w:rPr>
-        <w:t>SubSub</w:t>
-      </w:r>
-      <w:proofErr w:type="spellEnd"/>
-      <w:r>
-        <w:rPr>
-          <w:b/>
-          <w:bCs/>
-          <w:color w:val="FF0000"/>
-          <w:lang w:val="en-US"/>
-        </w:rPr>
-        <w:t xml:space="preserve"> I</w:t>
-      </w:r>
-    </w:p>
-    <w:p>
-      <w:pPr>
-        <w:rPr>
-          <w:color w:val="FF0000"/>
-          <w:lang w:val="en-US"/>
-        </w:rPr>
-      </w:pPr>
-      <w:r>
-        <w:rPr>
-          <w:color w:val="FF0000"/>
-          <w:lang w:val="en-US"/>
-        </w:rPr>
-        <w:t>&lt;</w:t>
-      </w:r>
-      <w:proofErr w:type="spellStart"/>
-      <w:proofErr w:type="gramStart"/>
-      <w:r>
-        <w:rPr>
-          <w:color w:val="FF0000"/>
-          <w:lang w:val="en-US"/>
-        </w:rPr>
-        <w:t>marker:content</w:t>
-      </w:r>
-      <w:proofErr w:type="spellEnd"/>
-      <w:proofErr w:type="gramEnd"/>
-      <w:r>
-        <w:rPr>
-          <w:color w:val="FF0000"/>
-          <w:lang w:val="en-US"/>
-        </w:rPr>
-        <w:t>/&gt;</w:t>
-      </w:r>
-    </w:p>
-    <w:p>
-      <w:pPr>
-        <w:rPr>
-          <w:color w:val="FF0000"/>
-          <w:lang w:val="en-US"/>
-        </w:rPr>
-      </w:pPr>
-      <w:r>
-        <w:rPr>
-          <w:color w:val="FF0000"/>
-          <w:lang w:val="en-US"/>
-        </w:rPr>
-        <w:t>&lt;/</w:t>
-      </w:r>
-      <w:proofErr w:type="spellStart"/>
-      <w:proofErr w:type="gramStart"/>
-      <w:r>
-        <w:rPr>
-          <w:color w:val="FF0000"/>
-          <w:lang w:val="en-US"/>
-        </w:rPr>
-        <w:t>sub3section:secondsubsubi</w:t>
-      </w:r>
-      <w:proofErr w:type="spellEnd"/>
-      <w:proofErr w:type="gramEnd"/>
-      <w:r>
-        <w:rPr>
-          <w:color w:val="FF0000"/>
-          <w:lang w:val="en-US"/>
-        </w:rPr>
-        <w:t>&gt;</w:t>
-      </w:r>
-    </w:p>
-    <w:p>
-      <w:pPr>
-        <w:rPr>
-          <w:color w:val="FF0000"/>
-          <w:lang w:val="en-US"/>
-        </w:rPr>
-      </w:pPr>
-      <w:r>
-        <w:rPr>
-          <w:color w:val="FF0000"/>
-          <w:lang w:val="en-US"/>
-        </w:rPr>
-        <w:t>&lt;</w:t>
-      </w:r>
-      <w:proofErr w:type="spellStart"/>
-      <w:proofErr w:type="gramStart"/>
-      <w:r>
-        <w:rPr>
-          <w:color w:val="FF0000"/>
-          <w:lang w:val="en-US"/>
-        </w:rPr>
-        <w:t>marker:content</w:t>
-      </w:r>
-      <w:proofErr w:type="spellEnd"/>
-      <w:proofErr w:type="gramEnd"/>
-      <w:r>
-        <w:rPr>
-          <w:color w:val="FF0000"/>
-          <w:lang w:val="en-US"/>
-        </w:rPr>
-        <w:t>/&gt;</w:t>
-      </w:r>
-    </w:p>
-    <w:p>
-      <w:pPr>
-        <w:rPr>
-          <w:color w:val="FF0000"/>
-          <w:lang w:val="en-US"/>
-        </w:rPr>
-      </w:pPr>
-      <w:r>
-        <w:rPr>
-          <w:color w:val="FF0000"/>
-          <w:lang w:val="en-US"/>
-        </w:rPr>
-        <w:t>&lt;/</w:t>
-      </w:r>
-      <w:proofErr w:type="gramStart"/>
-      <w:r>
-        <w:rPr>
-          <w:color w:val="FF0000"/>
-          <w:lang w:val="en-US"/>
-        </w:rPr>
-        <w:t>subsubsection:secondsub</w:t>
-      </w:r>
-      <w:proofErr w:type="gramEnd"/>
-      <w:r>
-        <w:rPr>
-          <w:color w:val="FF0000"/>
-          <w:lang w:val="en-US"/>
-        </w:rPr>
-        <w:t>1&gt;</w:t>
-      </w:r>
-    </w:p>
-    <w:p>
-      <w:pPr>
-        <w:rPr>
-          <w:color w:val="FF0000"/>
-          <w:lang w:val="en-US"/>
-        </w:rPr>
-      </w:pPr>
-      <w:r>
-        <w:rPr>
-          <w:color w:val="FF0000"/>
-          <w:lang w:val="en-US"/>
-        </w:rPr>
-        <w:t>&lt;</w:t>
-      </w:r>
-      <w:proofErr w:type="spellStart"/>
-      <w:proofErr w:type="gramStart"/>
-      <w:r>
-        <w:rPr>
-          <w:color w:val="FF0000"/>
-          <w:lang w:val="en-US"/>
-        </w:rPr>
-        <w:t>marker:content</w:t>
-      </w:r>
-      <w:proofErr w:type="spellEnd"/>
-      <w:proofErr w:type="gramEnd"/>
-      <w:r>
-        <w:rPr>
-          <w:color w:val="FF0000"/>
-          <w:lang w:val="en-US"/>
-        </w:rPr>
-        <w:t>/&gt;</w:t>
-      </w:r>
-    </w:p>
-    <w:p>
-      <w:pPr>
-        <w:rPr>
-          <w:color w:val="FF0000"/>
-          <w:lang w:val="en-US"/>
-        </w:rPr>
-      </w:pPr>
-      <w:r>
-        <w:rPr>
-          <w:color w:val="FF0000"/>
-          <w:lang w:val="en-US"/>
-        </w:rPr>
-        <w:t>&lt;/</w:t>
-      </w:r>
-      <w:proofErr w:type="spellStart"/>
-      <w:proofErr w:type="gramStart"/>
-      <w:r>
-        <w:rPr>
-          <w:color w:val="FF0000"/>
-          <w:lang w:val="en-US"/>
-        </w:rPr>
-        <w:t>subsection:seconda</w:t>
-      </w:r>
-      <w:proofErr w:type="spellEnd"/>
-      <w:proofErr w:type="gramEnd"/>
-      <w:r>
-        <w:rPr>
-          <w:color w:val="FF0000"/>
-          <w:lang w:val="en-US"/>
-        </w:rPr>
-        <w:t>&gt;</w:t>
-      </w:r>
-    </w:p>
-    <w:p>
-      <w:pPr>
-        <w:rPr>
-          <w:color w:val="00B0F0"/>
-          <w:lang w:val="en-US"/>
-        </w:rPr>
-      </w:pPr>
-      <w:r>
-        <w:rPr>
-          <w:color w:val="00B0F0"/>
-          <w:lang w:val="en-US"/>
-        </w:rPr>
-        <w:t>Between the subsections</w:t>
-      </w:r>
-    </w:p>
-    <w:p>
-      <w:pPr>
-        <w:pStyle w:val="Heading2"/>
-        <w:rPr>
-          <w:color w:val="00B050"/>
-          <w:lang w:val="en-US"/>
-        </w:rPr>
-      </w:pPr>
-      <w:r>
-        <w:rPr>
-          <w:color w:val="00B050"/>
-          <w:lang w:val="en-US"/>
-        </w:rPr>
-        <w:t>&lt;</w:t>
-      </w:r>
-      <w:proofErr w:type="spellStart"/>
-      <w:proofErr w:type="gramStart"/>
-      <w:r>
-        <w:rPr>
-          <w:color w:val="00B050"/>
-          <w:lang w:val="en-US"/>
-        </w:rPr>
-        <w:t>subsection:secondb</w:t>
-      </w:r>
-      <w:proofErr w:type="spellEnd"/>
-      <w:proofErr w:type="gramEnd"/>
-      <w:r>
-        <w:rPr>
-          <w:color w:val="00B050"/>
-          <w:lang w:val="en-US"/>
-        </w:rPr>
-        <w:t xml:space="preserve"> template</w:t>
-      </w:r>
-      <w:r>
-        <w:rPr>
-          <w:color w:val="00B050"/>
-          <w:lang w:val="en-US"/>
-        </w:rPr>
-        <w:t>&gt;&lt;head/&gt;</w:t>
-      </w:r>
-    </w:p>
-    <w:p>
-      <w:pPr>
-        <w:rPr>
-          <w:color w:val="00B050"/>
-          <w:lang w:val="en-US"/>
-        </w:rPr>
-      </w:pPr>
-      <w:r>
-        <w:rPr>
-          <w:color w:val="00B050"/>
-          <w:lang w:val="en-US"/>
-        </w:rPr>
-        <w:t>&lt;</w:t>
-      </w:r>
-      <w:proofErr w:type="spellStart"/>
-      <w:proofErr w:type="gramStart"/>
-      <w:r>
-        <w:rPr>
-          <w:color w:val="00B050"/>
-          <w:lang w:val="en-US"/>
-        </w:rPr>
-        <w:t>text:description</w:t>
-      </w:r>
-      <w:proofErr w:type="spellEnd"/>
-      <w:proofErr w:type="gramEnd"/>
-      <w:r>
-        <w:rPr>
-          <w:color w:val="00B050"/>
-          <w:lang w:val="en-US"/>
-        </w:rPr>
-        <w:t>/&gt;</w:t>
-      </w:r>
-    </w:p>
-    <w:p>
-      <w:pPr>
-        <w:rPr>
-          <w:color w:val="00B050"/>
-          <w:lang w:val="en-US"/>
-        </w:rPr>
-      </w:pPr>
-      <w:r>
-        <w:rPr>
-          <w:color w:val="00B050"/>
-          <w:lang w:val="en-US"/>
-        </w:rPr>
-        <w:t>&lt;</w:t>
-      </w:r>
-      <w:proofErr w:type="spellStart"/>
-      <w:proofErr w:type="gramStart"/>
-      <w:r>
-        <w:rPr>
-          <w:color w:val="00B050"/>
-          <w:lang w:val="en-US"/>
-        </w:rPr>
-        <w:t>marker:content</w:t>
-      </w:r>
-      <w:proofErr w:type="spellEnd"/>
-      <w:proofErr w:type="gramEnd"/>
-      <w:r>
-        <w:rPr>
-          <w:color w:val="00B050"/>
-          <w:lang w:val="en-US"/>
-        </w:rPr>
-        <w:t>/&gt;</w:t>
-      </w:r>
-    </w:p>
-    <w:p>
-      <w:pPr>
-        <w:rPr>
-          <w:color w:val="00B050"/>
-          <w:lang w:val="en-US"/>
-        </w:rPr>
-      </w:pPr>
-      <w:r>
-        <w:rPr>
-          <w:color w:val="00B050"/>
-          <w:lang w:val="en-US"/>
-        </w:rPr>
-        <w:t>&lt;/</w:t>
-      </w:r>
-      <w:proofErr w:type="spellStart"/>
-      <w:proofErr w:type="gramStart"/>
-      <w:r>
-        <w:rPr>
-          <w:color w:val="00B050"/>
-          <w:lang w:val="en-US"/>
-        </w:rPr>
-        <w:t>subsection:secondb</w:t>
-      </w:r>
-      <w:proofErr w:type="spellEnd"/>
-      <w:proofErr w:type="gramEnd"/>
-      <w:r>
-        <w:rPr>
-          <w:color w:val="00B050"/>
-          <w:lang w:val="en-US"/>
-        </w:rPr>
-        <w:t>&gt;</w:t>
-      </w:r>
-    </w:p>
-    <w:p>
-      <w:pPr>
-        <w:rPr>
-          <w:color w:val="00B0F0"/>
-          <w:lang w:val="en-US"/>
-        </w:rPr>
-      </w:pPr>
-      <w:r>
-        <w:rPr>
-          <w:color w:val="00B0F0"/>
-          <w:lang w:val="en-US"/>
-        </w:rPr>
-        <w:t>After the subsections</w:t>
-      </w:r>
-    </w:p>
-    <w:p>
-      <w:pPr>
-        <w:rPr>
-          <w:color w:val="00B0F0"/>
-          <w:lang w:val="en-US"/>
-        </w:rPr>
-      </w:pPr>
-      <w:r>
-        <w:rPr>
-          <w:color w:val="00B0F0"/>
-          <w:lang w:val="en-US"/>
-        </w:rPr>
-        <w:t>&lt;</w:t>
-      </w:r>
-      <w:proofErr w:type="spellStart"/>
-      <w:proofErr w:type="gramStart"/>
-      <w:r>
-        <w:rPr>
-          <w:color w:val="00B0F0"/>
-          <w:lang w:val="en-US"/>
-        </w:rPr>
-        <w:t>marker:content</w:t>
-      </w:r>
-      <w:proofErr w:type="spellEnd"/>
-      <w:proofErr w:type="gramEnd"/>
-      <w:r>
-        <w:rPr>
-          <w:color w:val="00B0F0"/>
-          <w:lang w:val="en-US"/>
-        </w:rPr>
-        <w:t>/&gt;</w:t>
-      </w:r>
-    </w:p>
-    <w:p>
-      <w:pPr>
+        <w:ind w:left="2124"/>
         <w:rPr>
           <w:i/>
           <w:iCs/>
+          <w:color w:val="C45911" w:themeColor="accent2" w:themeShade="BF"/>
           <w:lang w:val="en-US"/>
         </w:rPr>
       </w:pPr>
@@ -1000,26 +748,810 @@
         <w:rPr>
           <w:i/>
           <w:iCs/>
-          <w:lang w:val="en-US"/>
-        </w:rPr>
-        <w:t>Date published: &lt;</w:t>
-      </w:r>
-      <w:proofErr w:type="spellStart"/>
-      <w:proofErr w:type="gramStart"/>
-      <w:r>
+          <w:color w:val="C45911" w:themeColor="accent2" w:themeShade="BF"/>
+          <w:lang w:val="en-US"/>
+        </w:rPr>
+        <w:t>Here is a marker inside sub3:</w:t>
+      </w:r>
+    </w:p>
+    <w:p>
+      <w:pPr>
+        <w:ind w:left="2124"/>
         <w:rPr>
           <w:i/>
           <w:iCs/>
-          <w:lang w:val="en-US"/>
-        </w:rPr>
-        <w:t>date:published</w:t>
-      </w:r>
-      <w:proofErr w:type="spellEnd"/>
-      <w:proofErr w:type="gramEnd"/>
+          <w:color w:val="C45911" w:themeColor="accent2" w:themeShade="BF"/>
+          <w:lang w:val="en-US"/>
+        </w:rPr>
+      </w:pPr>
       <w:r>
         <w:rPr>
           <w:i/>
           <w:iCs/>
+          <w:color w:val="C45911" w:themeColor="accent2" w:themeShade="BF"/>
+          <w:lang w:val="en-US"/>
+        </w:rPr>
+        <w:t>&lt;</w:t>
+      </w:r>
+      <w:proofErr w:type="spellStart"/>
+      <w:r>
+        <w:rPr>
+          <w:i/>
+          <w:iCs/>
+          <w:color w:val="C45911" w:themeColor="accent2" w:themeShade="BF"/>
+          <w:lang w:val="en-US"/>
+        </w:rPr>
+        <w:t>marker:content</w:t>
+      </w:r>
+      <w:proofErr w:type="spellEnd"/>
+      <w:r>
+        <w:rPr>
+          <w:i/>
+          <w:iCs/>
+          <w:color w:val="C45911" w:themeColor="accent2" w:themeShade="BF"/>
+          <w:lang w:val="en-US"/>
+        </w:rPr>
+        <w:t>/&gt;</w:t>
+      </w:r>
+    </w:p>
+    <w:p>
+      <w:pPr>
+        <w:ind w:left="2124"/>
+        <w:rPr>
+          <w:i/>
+          <w:iCs/>
+          <w:color w:val="C45911" w:themeColor="accent2" w:themeShade="BF"/>
+          <w:lang w:val="en-US"/>
+        </w:rPr>
+      </w:pPr>
+      <w:r>
+        <w:rPr>
+          <w:i/>
+          <w:iCs/>
+          <w:color w:val="C45911" w:themeColor="accent2" w:themeShade="BF"/>
+          <w:lang w:val="en-US"/>
+        </w:rPr>
+        <w:t xml:space="preserve">Here ends sub3 </w:t>
+      </w:r>
+      <w:proofErr w:type="spellStart"/>
+      <w:r>
+        <w:rPr>
+          <w:i/>
+          <w:iCs/>
+          <w:color w:val="C45911" w:themeColor="accent2" w:themeShade="BF"/>
+          <w:lang w:val="en-US"/>
+        </w:rPr>
+        <w:t>secondsubsubi</w:t>
+      </w:r>
+      <w:proofErr w:type="spellEnd"/>
+      <w:r>
+        <w:rPr>
+          <w:i/>
+          <w:iCs/>
+          <w:color w:val="C45911" w:themeColor="accent2" w:themeShade="BF"/>
+          <w:lang w:val="en-US"/>
+        </w:rPr>
+        <w:t xml:space="preserve"> </w:t>
+      </w:r>
+      <w:r>
+        <w:rPr>
+          <w:i/>
+          <w:iCs/>
+          <w:color w:val="C45911" w:themeColor="accent2" w:themeShade="BF"/>
+          <w:lang w:val="en-US"/>
+        </w:rPr>
+        <w:t>&lt;/sub3section:secondsub</w:t>
+      </w:r>
+      <w:r>
+        <w:rPr>
+          <w:i/>
+          <w:iCs/>
+          <w:color w:val="C45911" w:themeColor="accent2" w:themeShade="BF"/>
+          <w:lang w:val="en-US"/>
+        </w:rPr>
+        <w:t>3</w:t>
+      </w:r>
+      <w:r>
+        <w:rPr>
+          <w:i/>
+          <w:iCs/>
+          <w:color w:val="C45911" w:themeColor="accent2" w:themeShade="BF"/>
+          <w:lang w:val="en-US"/>
+        </w:rPr>
+        <w:t>i&gt;</w:t>
+      </w:r>
+    </w:p>
+    <w:p>
+      <w:pPr>
+        <w:ind w:left="1416"/>
+        <w:rPr>
+          <w:color w:val="385623" w:themeColor="accent6" w:themeShade="80"/>
+          <w:lang w:val="en-US"/>
+        </w:rPr>
+      </w:pPr>
+      <w:r>
+        <w:rPr>
+          <w:color w:val="385623" w:themeColor="accent6" w:themeShade="80"/>
+          <w:lang w:val="en-US"/>
+        </w:rPr>
+        <w:t xml:space="preserve">Here is another marker inside </w:t>
+      </w:r>
+      <w:proofErr w:type="spellStart"/>
+      <w:r>
+        <w:rPr>
+          <w:color w:val="385623" w:themeColor="accent6" w:themeShade="80"/>
+          <w:lang w:val="en-US"/>
+        </w:rPr>
+        <w:t>subsub</w:t>
+      </w:r>
+      <w:proofErr w:type="spellEnd"/>
+    </w:p>
+    <w:p>
+      <w:pPr>
+        <w:ind w:left="1416"/>
+        <w:rPr>
+          <w:color w:val="385623" w:themeColor="accent6" w:themeShade="80"/>
+          <w:lang w:val="en-US"/>
+        </w:rPr>
+      </w:pPr>
+      <w:r>
+        <w:rPr>
+          <w:color w:val="385623" w:themeColor="accent6" w:themeShade="80"/>
+          <w:lang w:val="en-US"/>
+        </w:rPr>
+        <w:t>&lt;</w:t>
+      </w:r>
+      <w:proofErr w:type="spellStart"/>
+      <w:r>
+        <w:rPr>
+          <w:color w:val="385623" w:themeColor="accent6" w:themeShade="80"/>
+          <w:lang w:val="en-US"/>
+        </w:rPr>
+        <w:t>marker:content</w:t>
+      </w:r>
+      <w:proofErr w:type="spellEnd"/>
+      <w:r>
+        <w:rPr>
+          <w:color w:val="385623" w:themeColor="accent6" w:themeShade="80"/>
+          <w:lang w:val="en-US"/>
+        </w:rPr>
+        <w:t>/&gt;</w:t>
+      </w:r>
+    </w:p>
+    <w:p>
+      <w:pPr>
+        <w:ind w:left="1416"/>
+        <w:rPr>
+          <w:color w:val="FF0000"/>
+          <w:lang w:val="en-US"/>
+        </w:rPr>
+      </w:pPr>
+      <w:r>
+        <w:rPr>
+          <w:color w:val="385623" w:themeColor="accent6" w:themeShade="80"/>
+          <w:lang w:val="en-US"/>
+        </w:rPr>
+        <w:t xml:space="preserve">Here ends </w:t>
+      </w:r>
+      <w:proofErr w:type="spellStart"/>
+      <w:r>
+        <w:rPr>
+          <w:color w:val="385623" w:themeColor="accent6" w:themeShade="80"/>
+          <w:lang w:val="en-US"/>
+        </w:rPr>
+        <w:t>subsub</w:t>
+      </w:r>
+      <w:proofErr w:type="spellEnd"/>
+      <w:r>
+        <w:rPr>
+          <w:color w:val="385623" w:themeColor="accent6" w:themeShade="80"/>
+          <w:lang w:val="en-US"/>
+        </w:rPr>
+        <w:t xml:space="preserve"> </w:t>
+      </w:r>
+      <w:r>
+        <w:rPr>
+          <w:color w:val="385623" w:themeColor="accent6" w:themeShade="80"/>
+          <w:lang w:val="en-US"/>
+        </w:rPr>
+        <w:t>second</w:t>
+      </w:r>
+      <w:r>
+        <w:rPr>
+          <w:color w:val="385623" w:themeColor="accent6" w:themeShade="80"/>
+          <w:lang w:val="en-US"/>
+        </w:rPr>
+        <w:t>sub</w:t>
+      </w:r>
+      <w:r>
+        <w:rPr>
+          <w:color w:val="385623" w:themeColor="accent6" w:themeShade="80"/>
+          <w:lang w:val="en-US"/>
+        </w:rPr>
+        <w:t>sub1</w:t>
+      </w:r>
+      <w:r>
+        <w:rPr>
+          <w:color w:val="385623" w:themeColor="accent6" w:themeShade="80"/>
+          <w:lang w:val="en-US"/>
+        </w:rPr>
+        <w:t>&lt;/subsubsection:second</w:t>
+      </w:r>
+      <w:r>
+        <w:rPr>
+          <w:color w:val="385623" w:themeColor="accent6" w:themeShade="80"/>
+          <w:lang w:val="en-US"/>
+        </w:rPr>
+        <w:t>sub</w:t>
+      </w:r>
+      <w:r>
+        <w:rPr>
+          <w:color w:val="385623" w:themeColor="accent6" w:themeShade="80"/>
+          <w:lang w:val="en-US"/>
+        </w:rPr>
+        <w:t>sub1&gt;</w:t>
+      </w:r>
+    </w:p>
+    <w:p>
+      <w:pPr>
+        <w:ind w:left="708"/>
+        <w:rPr>
+          <w:color w:val="FF0000"/>
+          <w:lang w:val="en-US"/>
+        </w:rPr>
+      </w:pPr>
+      <w:r>
+        <w:rPr>
+          <w:color w:val="FF0000"/>
+          <w:lang w:val="en-US"/>
+        </w:rPr>
+        <w:t xml:space="preserve">Marker of </w:t>
+      </w:r>
+      <w:proofErr w:type="spellStart"/>
+      <w:r>
+        <w:rPr>
+          <w:color w:val="FF0000"/>
+          <w:lang w:val="en-US"/>
+        </w:rPr>
+        <w:t>secondsuba</w:t>
+      </w:r>
+      <w:proofErr w:type="spellEnd"/>
+      <w:r>
+        <w:rPr>
+          <w:color w:val="FF0000"/>
+          <w:lang w:val="en-US"/>
+        </w:rPr>
+        <w:t>:</w:t>
+      </w:r>
+    </w:p>
+    <w:p>
+      <w:pPr>
+        <w:ind w:left="708"/>
+        <w:rPr>
+          <w:color w:val="FF0000"/>
+          <w:lang w:val="en-US"/>
+        </w:rPr>
+      </w:pPr>
+      <w:r>
+        <w:rPr>
+          <w:color w:val="FF0000"/>
+          <w:lang w:val="en-US"/>
+        </w:rPr>
+        <w:t>&lt;</w:t>
+      </w:r>
+      <w:proofErr w:type="spellStart"/>
+      <w:r>
+        <w:rPr>
+          <w:color w:val="FF0000"/>
+          <w:lang w:val="en-US"/>
+        </w:rPr>
+        <w:t>marker:content</w:t>
+      </w:r>
+      <w:proofErr w:type="spellEnd"/>
+      <w:r>
+        <w:rPr>
+          <w:color w:val="FF0000"/>
+          <w:lang w:val="en-US"/>
+        </w:rPr>
+        <w:t>/&gt;</w:t>
+      </w:r>
+    </w:p>
+    <w:p>
+      <w:pPr>
+        <w:ind w:left="708"/>
+        <w:rPr>
+          <w:color w:val="FF0000"/>
+          <w:lang w:val="en-US"/>
+        </w:rPr>
+      </w:pPr>
+      <w:r>
+        <w:rPr>
+          <w:color w:val="FF0000"/>
+          <w:lang w:val="en-US"/>
+        </w:rPr>
+        <w:t xml:space="preserve">Here ends sub </w:t>
+      </w:r>
+      <w:proofErr w:type="spellStart"/>
+      <w:r>
+        <w:rPr>
+          <w:color w:val="FF0000"/>
+          <w:lang w:val="en-US"/>
+        </w:rPr>
+        <w:t>seconda</w:t>
+      </w:r>
+      <w:proofErr w:type="spellEnd"/>
+      <w:r>
+        <w:rPr>
+          <w:color w:val="FF0000"/>
+          <w:lang w:val="en-US"/>
+        </w:rPr>
+        <w:t>&lt;/</w:t>
+      </w:r>
+      <w:proofErr w:type="spellStart"/>
+      <w:r>
+        <w:rPr>
+          <w:color w:val="FF0000"/>
+          <w:lang w:val="en-US"/>
+        </w:rPr>
+        <w:t>subsection:second</w:t>
+      </w:r>
+      <w:r>
+        <w:rPr>
+          <w:color w:val="FF0000"/>
+          <w:lang w:val="en-US"/>
+        </w:rPr>
+        <w:t>sub</w:t>
+      </w:r>
+      <w:r>
+        <w:rPr>
+          <w:color w:val="FF0000"/>
+          <w:lang w:val="en-US"/>
+        </w:rPr>
+        <w:t>a</w:t>
+      </w:r>
+      <w:proofErr w:type="spellEnd"/>
+      <w:r>
+        <w:rPr>
+          <w:color w:val="FF0000"/>
+          <w:lang w:val="en-US"/>
+        </w:rPr>
+        <w:t>&gt;</w:t>
+      </w:r>
+    </w:p>
+    <w:p>
+      <w:pPr>
+        <w:rPr>
+          <w:color w:val="00B0F0"/>
+          <w:lang w:val="en-US"/>
+        </w:rPr>
+      </w:pPr>
+      <w:r>
+        <w:rPr>
+          <w:color w:val="00B0F0"/>
+          <w:lang w:val="en-US"/>
+        </w:rPr>
+        <w:t>Between the subsections</w:t>
+      </w:r>
+    </w:p>
+    <w:p>
+      <w:pPr>
+        <w:rPr>
+          <w:color w:val="00B050"/>
+          <w:lang w:val="en-US"/>
+        </w:rPr>
+      </w:pPr>
+      <w:r>
+        <w:rPr>
+          <w:color w:val="00B0F0"/>
+          <w:lang w:val="en-US"/>
+        </w:rPr>
+        <w:tab/>
+      </w:r>
+      <w:r>
+        <w:rPr>
+          <w:color w:val="00B050"/>
+          <w:lang w:val="en-US"/>
+        </w:rPr>
+        <w:t xml:space="preserve">Subsection </w:t>
+      </w:r>
+      <w:proofErr w:type="spellStart"/>
+      <w:r>
+        <w:rPr>
+          <w:color w:val="00B050"/>
+          <w:lang w:val="en-US"/>
+        </w:rPr>
+        <w:t>secondsubb</w:t>
+      </w:r>
+      <w:proofErr w:type="spellEnd"/>
+      <w:r>
+        <w:rPr>
+          <w:color w:val="00B050"/>
+          <w:lang w:val="en-US"/>
+        </w:rPr>
+        <w:t xml:space="preserve"> is not really used and thus it will vanish in the final document</w:t>
+      </w:r>
+      <w:r>
+        <w:rPr>
+          <w:color w:val="00B050"/>
+          <w:lang w:val="en-US"/>
+        </w:rPr>
+        <w:t>:</w:t>
+      </w:r>
+    </w:p>
+    <w:p>
+      <w:pPr>
+        <w:pStyle w:val="Heading2"/>
+        <w:ind w:left="708"/>
+        <w:rPr>
+          <w:color w:val="00B050"/>
+          <w:lang w:val="en-US"/>
+        </w:rPr>
+      </w:pPr>
+      <w:r>
+        <w:rPr>
+          <w:color w:val="00B050"/>
+          <w:lang w:val="en-US"/>
+        </w:rPr>
+        <w:t>&lt;</w:t>
+      </w:r>
+      <w:proofErr w:type="spellStart"/>
+      <w:r>
+        <w:rPr>
+          <w:color w:val="00B050"/>
+          <w:lang w:val="en-US"/>
+        </w:rPr>
+        <w:t>subsection:second</w:t>
+      </w:r>
+      <w:r>
+        <w:rPr>
+          <w:color w:val="00B050"/>
+          <w:lang w:val="en-US"/>
+        </w:rPr>
+        <w:t>sub</w:t>
+      </w:r>
+      <w:r>
+        <w:rPr>
+          <w:color w:val="00B050"/>
+          <w:lang w:val="en-US"/>
+        </w:rPr>
+        <w:t>b</w:t>
+      </w:r>
+      <w:proofErr w:type="spellEnd"/>
+      <w:r>
+        <w:rPr>
+          <w:color w:val="00B050"/>
+          <w:lang w:val="en-US"/>
+        </w:rPr>
+        <w:t xml:space="preserve"> template</w:t>
+      </w:r>
+      <w:r>
+        <w:rPr>
+          <w:color w:val="00B050"/>
+          <w:lang w:val="en-US"/>
+        </w:rPr>
+        <w:t>&gt;</w:t>
+      </w:r>
+      <w:r>
+        <w:rPr>
+          <w:color w:val="00B050"/>
+          <w:lang w:val="en-US"/>
+        </w:rPr>
+        <w:t xml:space="preserve"> - </w:t>
+      </w:r>
+      <w:r>
+        <w:rPr>
+          <w:color w:val="00B050"/>
+          <w:lang w:val="en-US"/>
+        </w:rPr>
+        <w:t xml:space="preserve">SUB </w:t>
+      </w:r>
+      <w:r>
+        <w:rPr>
+          <w:color w:val="00B050"/>
+          <w:lang w:val="en-US"/>
+        </w:rPr>
+        <w:t xml:space="preserve">SECONDB - </w:t>
+      </w:r>
+      <w:r>
+        <w:rPr>
+          <w:color w:val="00B050"/>
+          <w:lang w:val="en-US"/>
+        </w:rPr>
+        <w:t>&lt;head/&gt;</w:t>
+      </w:r>
+    </w:p>
+    <w:p>
+      <w:pPr>
+        <w:ind w:left="708"/>
+        <w:rPr>
+          <w:color w:val="00B050"/>
+          <w:lang w:val="en-US"/>
+        </w:rPr>
+      </w:pPr>
+      <w:r>
+        <w:rPr>
+          <w:color w:val="00B050"/>
+          <w:lang w:val="en-US"/>
+        </w:rPr>
+        <w:t xml:space="preserve">DESC: </w:t>
+      </w:r>
+      <w:r>
+        <w:rPr>
+          <w:color w:val="00B050"/>
+          <w:lang w:val="en-US"/>
+        </w:rPr>
+        <w:t>&lt;</w:t>
+      </w:r>
+      <w:proofErr w:type="spellStart"/>
+      <w:r>
+        <w:rPr>
+          <w:color w:val="00B050"/>
+          <w:lang w:val="en-US"/>
+        </w:rPr>
+        <w:t>text:description</w:t>
+      </w:r>
+      <w:proofErr w:type="spellEnd"/>
+      <w:r>
+        <w:rPr>
+          <w:color w:val="00B050"/>
+          <w:lang w:val="en-US"/>
+        </w:rPr>
+        <w:t>/&gt;</w:t>
+      </w:r>
+    </w:p>
+    <w:p>
+      <w:pPr>
+        <w:ind w:left="708"/>
+        <w:rPr>
+          <w:color w:val="00B050"/>
+          <w:lang w:val="en-US"/>
+        </w:rPr>
+      </w:pPr>
+      <w:r>
+        <w:rPr>
+          <w:color w:val="00B050"/>
+          <w:lang w:val="en-US"/>
+        </w:rPr>
+        <w:t>Marke</w:t>
+      </w:r>
+      <w:r>
+        <w:rPr>
+          <w:color w:val="00B050"/>
+          <w:lang w:val="en-US"/>
+        </w:rPr>
+        <w:t xml:space="preserve">r of </w:t>
+      </w:r>
+      <w:proofErr w:type="spellStart"/>
+      <w:r>
+        <w:rPr>
+          <w:color w:val="00B050"/>
+          <w:lang w:val="en-US"/>
+        </w:rPr>
+        <w:t>secondsubb</w:t>
+      </w:r>
+      <w:proofErr w:type="spellEnd"/>
+      <w:r>
+        <w:rPr>
+          <w:color w:val="00B050"/>
+          <w:lang w:val="en-US"/>
+        </w:rPr>
+        <w:t xml:space="preserve">: </w:t>
+      </w:r>
+    </w:p>
+    <w:p>
+      <w:pPr>
+        <w:ind w:left="708"/>
+        <w:rPr>
+          <w:color w:val="00B050"/>
+          <w:lang w:val="en-US"/>
+        </w:rPr>
+      </w:pPr>
+      <w:r>
+        <w:rPr>
+          <w:color w:val="00B050"/>
+          <w:lang w:val="en-US"/>
+        </w:rPr>
+        <w:t>&lt;</w:t>
+      </w:r>
+      <w:proofErr w:type="spellStart"/>
+      <w:r>
+        <w:rPr>
+          <w:color w:val="00B050"/>
+          <w:lang w:val="en-US"/>
+        </w:rPr>
+        <w:t>marker:content</w:t>
+      </w:r>
+      <w:proofErr w:type="spellEnd"/>
+      <w:r>
+        <w:rPr>
+          <w:color w:val="00B050"/>
+          <w:lang w:val="en-US"/>
+        </w:rPr>
+        <w:t>/&gt;</w:t>
+      </w:r>
+    </w:p>
+    <w:p>
+      <w:pPr>
+        <w:ind w:left="708"/>
+        <w:rPr>
+          <w:color w:val="00B050"/>
+          <w:lang w:val="en-US"/>
+        </w:rPr>
+      </w:pPr>
+      <w:r>
+        <w:rPr>
+          <w:color w:val="00B050"/>
+          <w:lang w:val="en-US"/>
+        </w:rPr>
+        <w:t xml:space="preserve">END SUB </w:t>
+      </w:r>
+      <w:proofErr w:type="spellStart"/>
+      <w:r>
+        <w:rPr>
+          <w:color w:val="00B050"/>
+          <w:lang w:val="en-US"/>
+        </w:rPr>
+        <w:t>secondb</w:t>
+      </w:r>
+      <w:proofErr w:type="spellEnd"/>
+      <w:r>
+        <w:rPr>
+          <w:color w:val="00B050"/>
+          <w:lang w:val="en-US"/>
+        </w:rPr>
+        <w:t>&lt;/</w:t>
+      </w:r>
+      <w:proofErr w:type="spellStart"/>
+      <w:r>
+        <w:rPr>
+          <w:color w:val="00B050"/>
+          <w:lang w:val="en-US"/>
+        </w:rPr>
+        <w:t>subsection:second</w:t>
+      </w:r>
+      <w:r>
+        <w:rPr>
+          <w:color w:val="00B050"/>
+          <w:lang w:val="en-US"/>
+        </w:rPr>
+        <w:t>sub</w:t>
+      </w:r>
+      <w:r>
+        <w:rPr>
+          <w:color w:val="00B050"/>
+          <w:lang w:val="en-US"/>
+        </w:rPr>
+        <w:t>b</w:t>
+      </w:r>
+      <w:proofErr w:type="spellEnd"/>
+      <w:r>
+        <w:rPr>
+          <w:color w:val="00B050"/>
+          <w:lang w:val="en-US"/>
+        </w:rPr>
+        <w:t>&gt;</w:t>
+      </w:r>
+    </w:p>
+    <w:p>
+      <w:pPr>
+        <w:ind w:left="708"/>
+        <w:rPr>
+          <w:color w:val="00B050"/>
+          <w:lang w:val="en-US"/>
+        </w:rPr>
+      </w:pPr>
+      <w:r>
+        <w:rPr>
+          <w:color w:val="00B050"/>
+          <w:lang w:val="en-US"/>
+        </w:rPr>
+        <w:t xml:space="preserve">This is just behind that missing subsection </w:t>
+      </w:r>
+      <w:proofErr w:type="spellStart"/>
+      <w:r>
+        <w:rPr>
+          <w:color w:val="00B050"/>
+          <w:lang w:val="en-US"/>
+        </w:rPr>
+        <w:t>secondsubb</w:t>
+      </w:r>
+      <w:proofErr w:type="spellEnd"/>
+    </w:p>
+    <w:p>
+      <w:pPr>
+        <w:rPr>
+          <w:color w:val="00B0F0"/>
+          <w:lang w:val="en-US"/>
+        </w:rPr>
+      </w:pPr>
+      <w:r>
+        <w:rPr>
+          <w:color w:val="00B0F0"/>
+          <w:lang w:val="en-US"/>
+        </w:rPr>
+        <w:t>After the subsections</w:t>
+      </w:r>
+    </w:p>
+    <w:p>
+      <w:pPr>
+        <w:rPr>
+          <w:color w:val="00B0F0"/>
+          <w:lang w:val="en-US"/>
+        </w:rPr>
+      </w:pPr>
+      <w:r>
+        <w:rPr>
+          <w:color w:val="00B0F0"/>
+          <w:lang w:val="en-US"/>
+        </w:rPr>
+        <w:t>Marker in the section</w:t>
+      </w:r>
+    </w:p>
+    <w:p>
+      <w:pPr>
+        <w:rPr>
+          <w:color w:val="00B0F0"/>
+          <w:lang w:val="en-US"/>
+        </w:rPr>
+      </w:pPr>
+      <w:r>
+        <w:rPr>
+          <w:color w:val="00B0F0"/>
+          <w:lang w:val="en-US"/>
+        </w:rPr>
+        <w:t>&lt;</w:t>
+      </w:r>
+      <w:proofErr w:type="spellStart"/>
+      <w:r>
+        <w:rPr>
+          <w:color w:val="00B0F0"/>
+          <w:lang w:val="en-US"/>
+        </w:rPr>
+        <w:t>marker:content</w:t>
+      </w:r>
+      <w:proofErr w:type="spellEnd"/>
+      <w:r>
+        <w:rPr>
+          <w:color w:val="00B0F0"/>
+          <w:lang w:val="en-US"/>
+        </w:rPr>
+        <w:t>/&gt;</w:t>
+      </w:r>
+    </w:p>
+    <w:p>
+      <w:pPr>
+        <w:rPr>
+          <w:i/>
+          <w:iCs/>
+          <w:color w:val="00B0F0"/>
+          <w:lang w:val="en-US"/>
+        </w:rPr>
+      </w:pPr>
+      <w:r>
+        <w:rPr>
+          <w:i/>
+          <w:iCs/>
+          <w:color w:val="00B0F0"/>
+          <w:lang w:val="en-US"/>
+        </w:rPr>
+        <w:t>Date published: &lt;</w:t>
+      </w:r>
+      <w:proofErr w:type="spellStart"/>
+      <w:r>
+        <w:rPr>
+          <w:i/>
+          <w:iCs/>
+          <w:color w:val="00B0F0"/>
+          <w:lang w:val="en-US"/>
+        </w:rPr>
+        <w:t>date:published</w:t>
+      </w:r>
+      <w:proofErr w:type="spellEnd"/>
+      <w:r>
+        <w:rPr>
+          <w:i/>
+          <w:iCs/>
+          <w:color w:val="00B0F0"/>
           <w:lang w:val="en-US"/>
         </w:rPr>
         <w:t>/&gt;</w:t>
@@ -1043,10 +1575,25 @@
           <w:color w:val="00B0F0"/>
           <w:lang w:val="en-US"/>
         </w:rPr>
+        <w:t xml:space="preserve">END </w:t>
+      </w:r>
+      <w:proofErr w:type="spellStart"/>
+      <w:r>
+        <w:rPr>
+          <w:color w:val="00B0F0"/>
+          <w:lang w:val="en-US"/>
+        </w:rPr>
+        <w:t>section:second</w:t>
+      </w:r>
+      <w:proofErr w:type="spellEnd"/>
+      <w:r>
+        <w:rPr>
+          <w:color w:val="00B0F0"/>
+          <w:lang w:val="en-US"/>
+        </w:rPr>
         <w:t>&lt;/</w:t>
       </w:r>
       <w:proofErr w:type="spellStart"/>
-      <w:proofErr w:type="gramStart"/>
       <w:r>
         <w:rPr>
           <w:color w:val="00B0F0"/>
@@ -1055,7 +1602,6 @@
         <w:t>section:second</w:t>
       </w:r>
       <w:proofErr w:type="spellEnd"/>
-      <w:proofErr w:type="gramEnd"/>
       <w:r>
         <w:rPr>
           <w:color w:val="00B0F0"/>
@@ -1078,7 +1624,6 @@
         <w:t>&lt;</w:t>
       </w:r>
       <w:proofErr w:type="spellStart"/>
-      <w:proofErr w:type="gramStart"/>
       <w:r>
         <w:rPr>
           <w:lang w:val="en-US"/>
@@ -1086,7 +1631,6 @@
         <w:t>section:template</w:t>
       </w:r>
       <w:proofErr w:type="spellEnd"/>
-      <w:proofErr w:type="gramEnd"/>
       <w:r>
         <w:rPr>
           <w:lang w:val="en-US"/>
@@ -1120,7 +1664,6 @@
         <w:t>&lt;</w:t>
       </w:r>
       <w:proofErr w:type="spellStart"/>
-      <w:proofErr w:type="gramStart"/>
       <w:r>
         <w:rPr>
           <w:lang w:val="en-US"/>
@@ -1128,7 +1671,6 @@
         <w:t>text:generic</w:t>
       </w:r>
       <w:proofErr w:type="spellEnd"/>
-      <w:proofErr w:type="gramEnd"/>
       <w:r>
         <w:rPr>
           <w:lang w:val="en-US"/>
@@ -1151,7 +1693,6 @@
         <w:t>&lt;</w:t>
       </w:r>
       <w:proofErr w:type="spellStart"/>
-      <w:proofErr w:type="gramStart"/>
       <w:r>
         <w:rPr>
           <w:color w:val="00B050"/>
@@ -1160,7 +1701,6 @@
         <w:t>text:green</w:t>
       </w:r>
       <w:proofErr w:type="spellEnd"/>
-      <w:proofErr w:type="gramEnd"/>
       <w:r>
         <w:rPr>
           <w:color w:val="00B050"/>
@@ -1184,7 +1724,6 @@
         <w:t>&lt;</w:t>
       </w:r>
       <w:proofErr w:type="spellStart"/>
-      <w:proofErr w:type="gramStart"/>
       <w:r>
         <w:rPr>
           <w:color w:val="00B0F0"/>
@@ -1193,7 +1732,6 @@
         <w:t>text:blue</w:t>
       </w:r>
       <w:proofErr w:type="spellEnd"/>
-      <w:proofErr w:type="gramEnd"/>
       <w:r>
         <w:rPr>
           <w:color w:val="00B0F0"/>
@@ -1219,7 +1757,6 @@
         <w:t>&lt;</w:t>
       </w:r>
       <w:proofErr w:type="spellStart"/>
-      <w:proofErr w:type="gramStart"/>
       <w:r>
         <w:rPr>
           <w:i/>
@@ -1229,7 +1766,6 @@
         <w:t>text:italicred</w:t>
       </w:r>
       <w:proofErr w:type="spellEnd"/>
-      <w:proofErr w:type="gramEnd"/>
       <w:r>
         <w:rPr>
           <w:i/>
@@ -1254,7 +1790,6 @@
         <w:t>&lt;</w:t>
       </w:r>
       <w:proofErr w:type="spellStart"/>
-      <w:proofErr w:type="gramStart"/>
       <w:r>
         <w:rPr>
           <w:b/>
@@ -1263,7 +1798,6 @@
         <w:t>text:bold</w:t>
       </w:r>
       <w:proofErr w:type="spellEnd"/>
-      <w:proofErr w:type="gramEnd"/>
       <w:r>
         <w:rPr>
           <w:b/>
@@ -1319,7 +1853,6 @@
         <w:t>&lt;</w:t>
       </w:r>
       <w:proofErr w:type="spellStart"/>
-      <w:proofErr w:type="gramStart"/>
       <w:r>
         <w:rPr>
           <w:i/>
@@ -1329,7 +1862,6 @@
         <w:t>text:warning</w:t>
       </w:r>
       <w:proofErr w:type="spellEnd"/>
-      <w:proofErr w:type="gramEnd"/>
       <w:r>
         <w:rPr>
           <w:i/>
@@ -1362,7 +1894,6 @@
         <w:t>&lt;</w:t>
       </w:r>
       <w:proofErr w:type="spellStart"/>
-      <w:proofErr w:type="gramStart"/>
       <w:r>
         <w:rPr>
           <w:iCs/>
@@ -1371,7 +1902,6 @@
         <w:t>text:complex</w:t>
       </w:r>
       <w:proofErr w:type="spellEnd"/>
-      <w:proofErr w:type="gramEnd"/>
       <w:r>
         <w:rPr>
           <w:iCs/>
@@ -1436,6 +1966,15 @@
           <w:highlight w:val="yellow"/>
           <w:lang w:val="en-US"/>
         </w:rPr>
+        <w:t>/</w:t>
+      </w:r>
+      <w:r>
+        <w:rPr>
+          <w:iCs/>
+          <w:color w:val="00B0F0"/>
+          <w:highlight w:val="yellow"/>
+          <w:lang w:val="en-US"/>
+        </w:rPr>
         <w:t>&gt;</w:t>
       </w:r>
       <w:r>
@@ -1454,7 +1993,6 @@
         <w:t>&lt;</w:t>
       </w:r>
       <w:proofErr w:type="spellStart"/>
-      <w:proofErr w:type="gramStart"/>
       <w:r>
         <w:rPr>
           <w:iCs/>
@@ -1464,13 +2002,20 @@
         <w:t>placeholder:two</w:t>
       </w:r>
       <w:proofErr w:type="spellEnd"/>
-      <w:proofErr w:type="gramEnd"/>
       <w:r>
         <w:rPr>
           <w:iCs/>
           <w:color w:val="00B050"/>
           <w:lang w:val="en-US"/>
         </w:rPr>
+        <w:t>/</w:t>
+      </w:r>
+      <w:r>
+        <w:rPr>
+          <w:iCs/>
+          <w:color w:val="00B050"/>
+          <w:lang w:val="en-US"/>
+        </w:rPr>
         <w:t>&gt;</w:t>
       </w:r>
     </w:p>
@@ -1504,7 +2049,6 @@
         <w:t>&lt;/</w:t>
       </w:r>
       <w:proofErr w:type="spellStart"/>
-      <w:proofErr w:type="gramStart"/>
       <w:r>
         <w:rPr>
           <w:iCs/>
@@ -1513,7 +2057,6 @@
         <w:t>text:complex</w:t>
       </w:r>
       <w:proofErr w:type="spellEnd"/>
-      <w:proofErr w:type="gramEnd"/>
       <w:r>
         <w:rPr>
           <w:iCs/>
@@ -1555,7 +2098,6 @@
         <w:t>/</w:t>
       </w:r>
       <w:proofErr w:type="spellStart"/>
-      <w:proofErr w:type="gramStart"/>
       <w:r>
         <w:rPr>
           <w:lang w:val="en-US"/>
@@ -1563,7 +2105,6 @@
         <w:t>section:template</w:t>
       </w:r>
       <w:proofErr w:type="spellEnd"/>
-      <w:proofErr w:type="gramEnd"/>
       <w:r>
         <w:rPr>
           <w:lang w:val="en-US"/>
@@ -1584,7 +2125,7 @@
 </file>
 
 <file path=word/endnotes.xml><?xml version="1.0" encoding="utf-8"?>
-<w:endnotes xmlns:wpc="http://schemas.microsoft.com/office/word/2010/wordprocessingCanvas" xmlns:cx="http://schemas.microsoft.com/office/drawing/2014/chartex" xmlns:cx1="http://schemas.microsoft.com/office/drawing/2015/9/8/chartex" xmlns:cx2="http://schemas.microsoft.com/office/drawing/2015/10/21/chartex" xmlns:cx3="http://schemas.microsoft.com/office/drawing/2016/5/9/chartex" xmlns:cx4="http://schemas.microsoft.com/office/drawing/2016/5/10/chartex" xmlns:cx5="http://schemas.microsoft.com/office/drawing/2016/5/11/chartex" xmlns:cx6="http://schemas.microsoft.com/office/drawing/2016/5/12/chartex" xmlns:cx7="http://schemas.microsoft.com/office/drawing/2016/5/13/chartex" xmlns:cx8="http://schemas.microsoft.com/office/drawing/2016/5/14/chartex" xmlns:mc="http://schemas.openxmlformats.org/markup-compatibility/2006" xmlns:aink="http://schemas.microsoft.com/office/drawing/2016/ink" xmlns:am3d="http://schemas.microsoft.com/office/drawing/2017/model3d" xmlns:o="urn:schemas-microsoft-com:office:office" xmlns:r="http://schemas.openxmlformats.org/officeDocument/2006/relationships" xmlns:m="http://schemas.openxmlformats.org/officeDocument/2006/math" xmlns:v="urn:schemas-microsoft-com:vml" xmlns:wp14="http://schemas.microsoft.com/office/word/2010/wordprocessingDrawing" xmlns:wp="http://schemas.openxmlformats.org/drawingml/2006/wordprocessingDrawing" xmlns:w10="urn:schemas-microsoft-com:office:word" xmlns:w="http://schemas.openxmlformats.org/wordprocessingml/2006/main" xmlns:w14="http://schemas.microsoft.com/office/word/2010/wordml" xmlns:w15="http://schemas.microsoft.com/office/word/2012/wordml" xmlns:w16cex="http://schemas.microsoft.com/office/word/2018/wordml/cex" xmlns:w16cid="http://schemas.microsoft.com/office/word/2016/wordml/cid" xmlns:w16="http://schemas.microsoft.com/office/word/2018/wordml" xmlns:w16sdtdh="http://schemas.microsoft.com/office/word/2020/wordml/sdtdatahash" xmlns:w16se="http://schemas.microsoft.com/office/word/2015/wordml/symex" xmlns:wpg="http://schemas.microsoft.com/office/word/2010/wordprocessingGroup" xmlns:wpi="http://schemas.microsoft.com/office/word/2010/wordprocessingInk" xmlns:wne="http://schemas.microsoft.com/office/word/2006/wordml" xmlns:wps="http://schemas.microsoft.com/office/word/2010/wordprocessingShape" mc:Ignorable="w14 w15 w16se w16cid w16 w16cex w16sdtdh wp14">
+<w:endnotes xmlns:wpc="http://schemas.microsoft.com/office/word/2010/wordprocessingCanvas" xmlns:cx="http://schemas.microsoft.com/office/drawing/2014/chartex" xmlns:cx1="http://schemas.microsoft.com/office/drawing/2015/9/8/chartex" xmlns:cx2="http://schemas.microsoft.com/office/drawing/2015/10/21/chartex" xmlns:cx3="http://schemas.microsoft.com/office/drawing/2016/5/9/chartex" xmlns:cx4="http://schemas.microsoft.com/office/drawing/2016/5/10/chartex" xmlns:cx5="http://schemas.microsoft.com/office/drawing/2016/5/11/chartex" xmlns:cx6="http://schemas.microsoft.com/office/drawing/2016/5/12/chartex" xmlns:cx7="http://schemas.microsoft.com/office/drawing/2016/5/13/chartex" xmlns:cx8="http://schemas.microsoft.com/office/drawing/2016/5/14/chartex" xmlns:mc="http://schemas.openxmlformats.org/markup-compatibility/2006" xmlns:aink="http://schemas.microsoft.com/office/drawing/2016/ink" xmlns:am3d="http://schemas.microsoft.com/office/drawing/2017/model3d" xmlns:o="urn:schemas-microsoft-com:office:office" xmlns:oel="http://schemas.microsoft.com/office/2019/extlst" xmlns:r="http://schemas.openxmlformats.org/officeDocument/2006/relationships" xmlns:m="http://schemas.openxmlformats.org/officeDocument/2006/math" xmlns:v="urn:schemas-microsoft-com:vml" xmlns:wp14="http://schemas.microsoft.com/office/word/2010/wordprocessingDrawing" xmlns:wp="http://schemas.openxmlformats.org/drawingml/2006/wordprocessingDrawing" xmlns:w10="urn:schemas-microsoft-com:office:word" xmlns:w="http://schemas.openxmlformats.org/wordprocessingml/2006/main" xmlns:w14="http://schemas.microsoft.com/office/word/2010/wordml" xmlns:w15="http://schemas.microsoft.com/office/word/2012/wordml" xmlns:w16cex="http://schemas.microsoft.com/office/word/2018/wordml/cex" xmlns:w16cid="http://schemas.microsoft.com/office/word/2016/wordml/cid" xmlns:w16="http://schemas.microsoft.com/office/word/2018/wordml" xmlns:w16sdtdh="http://schemas.microsoft.com/office/word/2020/wordml/sdtdatahash" xmlns:w16se="http://schemas.microsoft.com/office/word/2015/wordml/symex" xmlns:wpg="http://schemas.microsoft.com/office/word/2010/wordprocessingGroup" xmlns:wpi="http://schemas.microsoft.com/office/word/2010/wordprocessingInk" xmlns:wne="http://schemas.microsoft.com/office/word/2006/wordml" xmlns:wps="http://schemas.microsoft.com/office/word/2010/wordprocessingShape" mc:Ignorable="w14 w15 w16se w16cid w16 w16cex w16sdtdh wp14">
   <w:endnote w:type="separator" w:id="-1">
     <w:p>
       <w:pPr>
@@ -1609,7 +2150,7 @@
 </file>
 
 <file path=word/footer1.xml><?xml version="1.0" encoding="utf-8"?>
-<w:ftr xmlns:wpc="http://schemas.microsoft.com/office/word/2010/wordprocessingCanvas" xmlns:cx="http://schemas.microsoft.com/office/drawing/2014/chartex" xmlns:cx1="http://schemas.microsoft.com/office/drawing/2015/9/8/chartex" xmlns:cx2="http://schemas.microsoft.com/office/drawing/2015/10/21/chartex" xmlns:cx3="http://schemas.microsoft.com/office/drawing/2016/5/9/chartex" xmlns:cx4="http://schemas.microsoft.com/office/drawing/2016/5/10/chartex" xmlns:cx5="http://schemas.microsoft.com/office/drawing/2016/5/11/chartex" xmlns:cx6="http://schemas.microsoft.com/office/drawing/2016/5/12/chartex" xmlns:cx7="http://schemas.microsoft.com/office/drawing/2016/5/13/chartex" xmlns:cx8="http://schemas.microsoft.com/office/drawing/2016/5/14/chartex" xmlns:mc="http://schemas.openxmlformats.org/markup-compatibility/2006" xmlns:aink="http://schemas.microsoft.com/office/drawing/2016/ink" xmlns:am3d="http://schemas.microsoft.com/office/drawing/2017/model3d" xmlns:o="urn:schemas-microsoft-com:office:office" xmlns:r="http://schemas.openxmlformats.org/officeDocument/2006/relationships" xmlns:m="http://schemas.openxmlformats.org/officeDocument/2006/math" xmlns:v="urn:schemas-microsoft-com:vml" xmlns:wp14="http://schemas.microsoft.com/office/word/2010/wordprocessingDrawing" xmlns:wp="http://schemas.openxmlformats.org/drawingml/2006/wordprocessingDrawing" xmlns:w10="urn:schemas-microsoft-com:office:word" xmlns:w="http://schemas.openxmlformats.org/wordprocessingml/2006/main" xmlns:w14="http://schemas.microsoft.com/office/word/2010/wordml" xmlns:w15="http://schemas.microsoft.com/office/word/2012/wordml" xmlns:w16cex="http://schemas.microsoft.com/office/word/2018/wordml/cex" xmlns:w16cid="http://schemas.microsoft.com/office/word/2016/wordml/cid" xmlns:w16="http://schemas.microsoft.com/office/word/2018/wordml" xmlns:w16sdtdh="http://schemas.microsoft.com/office/word/2020/wordml/sdtdatahash" xmlns:w16se="http://schemas.microsoft.com/office/word/2015/wordml/symex" xmlns:wpg="http://schemas.microsoft.com/office/word/2010/wordprocessingGroup" xmlns:wpi="http://schemas.microsoft.com/office/word/2010/wordprocessingInk" xmlns:wne="http://schemas.microsoft.com/office/word/2006/wordml" xmlns:wps="http://schemas.microsoft.com/office/word/2010/wordprocessingShape" mc:Ignorable="w14 w15 w16se w16cid w16 w16cex w16sdtdh wp14">
+<w:ftr xmlns:wpc="http://schemas.microsoft.com/office/word/2010/wordprocessingCanvas" xmlns:cx="http://schemas.microsoft.com/office/drawing/2014/chartex" xmlns:cx1="http://schemas.microsoft.com/office/drawing/2015/9/8/chartex" xmlns:cx2="http://schemas.microsoft.com/office/drawing/2015/10/21/chartex" xmlns:cx3="http://schemas.microsoft.com/office/drawing/2016/5/9/chartex" xmlns:cx4="http://schemas.microsoft.com/office/drawing/2016/5/10/chartex" xmlns:cx5="http://schemas.microsoft.com/office/drawing/2016/5/11/chartex" xmlns:cx6="http://schemas.microsoft.com/office/drawing/2016/5/12/chartex" xmlns:cx7="http://schemas.microsoft.com/office/drawing/2016/5/13/chartex" xmlns:cx8="http://schemas.microsoft.com/office/drawing/2016/5/14/chartex" xmlns:mc="http://schemas.openxmlformats.org/markup-compatibility/2006" xmlns:aink="http://schemas.microsoft.com/office/drawing/2016/ink" xmlns:am3d="http://schemas.microsoft.com/office/drawing/2017/model3d" xmlns:o="urn:schemas-microsoft-com:office:office" xmlns:oel="http://schemas.microsoft.com/office/2019/extlst" xmlns:r="http://schemas.openxmlformats.org/officeDocument/2006/relationships" xmlns:m="http://schemas.openxmlformats.org/officeDocument/2006/math" xmlns:v="urn:schemas-microsoft-com:vml" xmlns:wp14="http://schemas.microsoft.com/office/word/2010/wordprocessingDrawing" xmlns:wp="http://schemas.openxmlformats.org/drawingml/2006/wordprocessingDrawing" xmlns:w10="urn:schemas-microsoft-com:office:word" xmlns:w="http://schemas.openxmlformats.org/wordprocessingml/2006/main" xmlns:w14="http://schemas.microsoft.com/office/word/2010/wordml" xmlns:w15="http://schemas.microsoft.com/office/word/2012/wordml" xmlns:w16cex="http://schemas.microsoft.com/office/word/2018/wordml/cex" xmlns:w16cid="http://schemas.microsoft.com/office/word/2016/wordml/cid" xmlns:w16="http://schemas.microsoft.com/office/word/2018/wordml" xmlns:w16sdtdh="http://schemas.microsoft.com/office/word/2020/wordml/sdtdatahash" xmlns:w16se="http://schemas.microsoft.com/office/word/2015/wordml/symex" xmlns:wpg="http://schemas.microsoft.com/office/word/2010/wordprocessingGroup" xmlns:wpi="http://schemas.microsoft.com/office/word/2010/wordprocessingInk" xmlns:wne="http://schemas.microsoft.com/office/word/2006/wordml" xmlns:wps="http://schemas.microsoft.com/office/word/2010/wordprocessingShape" mc:Ignorable="w14 w15 w16se w16cid w16 w16cex w16sdtdh wp14">
   <w:p>
     <w:pPr>
       <w:pStyle w:val="Footer"/>
@@ -1648,7 +2189,7 @@
 </file>
 
 <file path=word/footer2.xml><?xml version="1.0" encoding="utf-8"?>
-<w:ftr xmlns:wpc="http://schemas.microsoft.com/office/word/2010/wordprocessingCanvas" xmlns:cx="http://schemas.microsoft.com/office/drawing/2014/chartex" xmlns:cx1="http://schemas.microsoft.com/office/drawing/2015/9/8/chartex" xmlns:cx2="http://schemas.microsoft.com/office/drawing/2015/10/21/chartex" xmlns:cx3="http://schemas.microsoft.com/office/drawing/2016/5/9/chartex" xmlns:cx4="http://schemas.microsoft.com/office/drawing/2016/5/10/chartex" xmlns:cx5="http://schemas.microsoft.com/office/drawing/2016/5/11/chartex" xmlns:cx6="http://schemas.microsoft.com/office/drawing/2016/5/12/chartex" xmlns:cx7="http://schemas.microsoft.com/office/drawing/2016/5/13/chartex" xmlns:cx8="http://schemas.microsoft.com/office/drawing/2016/5/14/chartex" xmlns:mc="http://schemas.openxmlformats.org/markup-compatibility/2006" xmlns:aink="http://schemas.microsoft.com/office/drawing/2016/ink" xmlns:am3d="http://schemas.microsoft.com/office/drawing/2017/model3d" xmlns:o="urn:schemas-microsoft-com:office:office" xmlns:r="http://schemas.openxmlformats.org/officeDocument/2006/relationships" xmlns:m="http://schemas.openxmlformats.org/officeDocument/2006/math" xmlns:v="urn:schemas-microsoft-com:vml" xmlns:wp14="http://schemas.microsoft.com/office/word/2010/wordprocessingDrawing" xmlns:wp="http://schemas.openxmlformats.org/drawingml/2006/wordprocessingDrawing" xmlns:w10="urn:schemas-microsoft-com:office:word" xmlns:w="http://schemas.openxmlformats.org/wordprocessingml/2006/main" xmlns:w14="http://schemas.microsoft.com/office/word/2010/wordml" xmlns:w15="http://schemas.microsoft.com/office/word/2012/wordml" xmlns:w16cex="http://schemas.microsoft.com/office/word/2018/wordml/cex" xmlns:w16cid="http://schemas.microsoft.com/office/word/2016/wordml/cid" xmlns:w16="http://schemas.microsoft.com/office/word/2018/wordml" xmlns:w16sdtdh="http://schemas.microsoft.com/office/word/2020/wordml/sdtdatahash" xmlns:w16se="http://schemas.microsoft.com/office/word/2015/wordml/symex" xmlns:wpg="http://schemas.microsoft.com/office/word/2010/wordprocessingGroup" xmlns:wpi="http://schemas.microsoft.com/office/word/2010/wordprocessingInk" xmlns:wne="http://schemas.microsoft.com/office/word/2006/wordml" xmlns:wps="http://schemas.microsoft.com/office/word/2010/wordprocessingShape" mc:Ignorable="w14 w15 w16se w16cid w16 w16cex w16sdtdh wp14">
+<w:ftr xmlns:wpc="http://schemas.microsoft.com/office/word/2010/wordprocessingCanvas" xmlns:cx="http://schemas.microsoft.com/office/drawing/2014/chartex" xmlns:cx1="http://schemas.microsoft.com/office/drawing/2015/9/8/chartex" xmlns:cx2="http://schemas.microsoft.com/office/drawing/2015/10/21/chartex" xmlns:cx3="http://schemas.microsoft.com/office/drawing/2016/5/9/chartex" xmlns:cx4="http://schemas.microsoft.com/office/drawing/2016/5/10/chartex" xmlns:cx5="http://schemas.microsoft.com/office/drawing/2016/5/11/chartex" xmlns:cx6="http://schemas.microsoft.com/office/drawing/2016/5/12/chartex" xmlns:cx7="http://schemas.microsoft.com/office/drawing/2016/5/13/chartex" xmlns:cx8="http://schemas.microsoft.com/office/drawing/2016/5/14/chartex" xmlns:mc="http://schemas.openxmlformats.org/markup-compatibility/2006" xmlns:aink="http://schemas.microsoft.com/office/drawing/2016/ink" xmlns:am3d="http://schemas.microsoft.com/office/drawing/2017/model3d" xmlns:o="urn:schemas-microsoft-com:office:office" xmlns:oel="http://schemas.microsoft.com/office/2019/extlst" xmlns:r="http://schemas.openxmlformats.org/officeDocument/2006/relationships" xmlns:m="http://schemas.openxmlformats.org/officeDocument/2006/math" xmlns:v="urn:schemas-microsoft-com:vml" xmlns:wp14="http://schemas.microsoft.com/office/word/2010/wordprocessingDrawing" xmlns:wp="http://schemas.openxmlformats.org/drawingml/2006/wordprocessingDrawing" xmlns:w10="urn:schemas-microsoft-com:office:word" xmlns:w="http://schemas.openxmlformats.org/wordprocessingml/2006/main" xmlns:w14="http://schemas.microsoft.com/office/word/2010/wordml" xmlns:w15="http://schemas.microsoft.com/office/word/2012/wordml" xmlns:w16cex="http://schemas.microsoft.com/office/word/2018/wordml/cex" xmlns:w16cid="http://schemas.microsoft.com/office/word/2016/wordml/cid" xmlns:w16="http://schemas.microsoft.com/office/word/2018/wordml" xmlns:w16sdtdh="http://schemas.microsoft.com/office/word/2020/wordml/sdtdatahash" xmlns:w16se="http://schemas.microsoft.com/office/word/2015/wordml/symex" xmlns:wpg="http://schemas.microsoft.com/office/word/2010/wordprocessingGroup" xmlns:wpi="http://schemas.microsoft.com/office/word/2010/wordprocessingInk" xmlns:wne="http://schemas.microsoft.com/office/word/2006/wordml" xmlns:wps="http://schemas.microsoft.com/office/word/2010/wordprocessingShape" mc:Ignorable="w14 w15 w16se w16cid w16 w16cex w16sdtdh wp14">
   <w:p>
     <w:pPr>
       <w:pStyle w:val="Footer"/>
@@ -1662,7 +2203,6 @@
       </w:rPr>
       <w:t xml:space="preserve">Foot sec </w:t>
     </w:r>
-    <w:proofErr w:type="gramStart"/>
     <w:r>
       <w:rPr>
         <w:lang w:val="en-US"/>
@@ -1676,7 +2216,6 @@
       <w:t xml:space="preserve"> &lt;</w:t>
     </w:r>
     <w:proofErr w:type="spellStart"/>
-    <w:proofErr w:type="gramEnd"/>
     <w:r>
       <w:rPr>
         <w:lang w:val="en-US"/>
@@ -1701,7 +2240,7 @@
 </file>
 
 <file path=word/footnotes.xml><?xml version="1.0" encoding="utf-8"?>
-<w:footnotes xmlns:wpc="http://schemas.microsoft.com/office/word/2010/wordprocessingCanvas" xmlns:cx="http://schemas.microsoft.com/office/drawing/2014/chartex" xmlns:cx1="http://schemas.microsoft.com/office/drawing/2015/9/8/chartex" xmlns:cx2="http://schemas.microsoft.com/office/drawing/2015/10/21/chartex" xmlns:cx3="http://schemas.microsoft.com/office/drawing/2016/5/9/chartex" xmlns:cx4="http://schemas.microsoft.com/office/drawing/2016/5/10/chartex" xmlns:cx5="http://schemas.microsoft.com/office/drawing/2016/5/11/chartex" xmlns:cx6="http://schemas.microsoft.com/office/drawing/2016/5/12/chartex" xmlns:cx7="http://schemas.microsoft.com/office/drawing/2016/5/13/chartex" xmlns:cx8="http://schemas.microsoft.com/office/drawing/2016/5/14/chartex" xmlns:mc="http://schemas.openxmlformats.org/markup-compatibility/2006" xmlns:aink="http://schemas.microsoft.com/office/drawing/2016/ink" xmlns:am3d="http://schemas.microsoft.com/office/drawing/2017/model3d" xmlns:o="urn:schemas-microsoft-com:office:office" xmlns:r="http://schemas.openxmlformats.org/officeDocument/2006/relationships" xmlns:m="http://schemas.openxmlformats.org/officeDocument/2006/math" xmlns:v="urn:schemas-microsoft-com:vml" xmlns:wp14="http://schemas.microsoft.com/office/word/2010/wordprocessingDrawing" xmlns:wp="http://schemas.openxmlformats.org/drawingml/2006/wordprocessingDrawing" xmlns:w10="urn:schemas-microsoft-com:office:word" xmlns:w="http://schemas.openxmlformats.org/wordprocessingml/2006/main" xmlns:w14="http://schemas.microsoft.com/office/word/2010/wordml" xmlns:w15="http://schemas.microsoft.com/office/word/2012/wordml" xmlns:w16cex="http://schemas.microsoft.com/office/word/2018/wordml/cex" xmlns:w16cid="http://schemas.microsoft.com/office/word/2016/wordml/cid" xmlns:w16="http://schemas.microsoft.com/office/word/2018/wordml" xmlns:w16sdtdh="http://schemas.microsoft.com/office/word/2020/wordml/sdtdatahash" xmlns:w16se="http://schemas.microsoft.com/office/word/2015/wordml/symex" xmlns:wpg="http://schemas.microsoft.com/office/word/2010/wordprocessingGroup" xmlns:wpi="http://schemas.microsoft.com/office/word/2010/wordprocessingInk" xmlns:wne="http://schemas.microsoft.com/office/word/2006/wordml" xmlns:wps="http://schemas.microsoft.com/office/word/2010/wordprocessingShape" mc:Ignorable="w14 w15 w16se w16cid w16 w16cex w16sdtdh wp14">
+<w:footnotes xmlns:wpc="http://schemas.microsoft.com/office/word/2010/wordprocessingCanvas" xmlns:cx="http://schemas.microsoft.com/office/drawing/2014/chartex" xmlns:cx1="http://schemas.microsoft.com/office/drawing/2015/9/8/chartex" xmlns:cx2="http://schemas.microsoft.com/office/drawing/2015/10/21/chartex" xmlns:cx3="http://schemas.microsoft.com/office/drawing/2016/5/9/chartex" xmlns:cx4="http://schemas.microsoft.com/office/drawing/2016/5/10/chartex" xmlns:cx5="http://schemas.microsoft.com/office/drawing/2016/5/11/chartex" xmlns:cx6="http://schemas.microsoft.com/office/drawing/2016/5/12/chartex" xmlns:cx7="http://schemas.microsoft.com/office/drawing/2016/5/13/chartex" xmlns:cx8="http://schemas.microsoft.com/office/drawing/2016/5/14/chartex" xmlns:mc="http://schemas.openxmlformats.org/markup-compatibility/2006" xmlns:aink="http://schemas.microsoft.com/office/drawing/2016/ink" xmlns:am3d="http://schemas.microsoft.com/office/drawing/2017/model3d" xmlns:o="urn:schemas-microsoft-com:office:office" xmlns:oel="http://schemas.microsoft.com/office/2019/extlst" xmlns:r="http://schemas.openxmlformats.org/officeDocument/2006/relationships" xmlns:m="http://schemas.openxmlformats.org/officeDocument/2006/math" xmlns:v="urn:schemas-microsoft-com:vml" xmlns:wp14="http://schemas.microsoft.com/office/word/2010/wordprocessingDrawing" xmlns:wp="http://schemas.openxmlformats.org/drawingml/2006/wordprocessingDrawing" xmlns:w10="urn:schemas-microsoft-com:office:word" xmlns:w="http://schemas.openxmlformats.org/wordprocessingml/2006/main" xmlns:w14="http://schemas.microsoft.com/office/word/2010/wordml" xmlns:w15="http://schemas.microsoft.com/office/word/2012/wordml" xmlns:w16cex="http://schemas.microsoft.com/office/word/2018/wordml/cex" xmlns:w16cid="http://schemas.microsoft.com/office/word/2016/wordml/cid" xmlns:w16="http://schemas.microsoft.com/office/word/2018/wordml" xmlns:w16sdtdh="http://schemas.microsoft.com/office/word/2020/wordml/sdtdatahash" xmlns:w16se="http://schemas.microsoft.com/office/word/2015/wordml/symex" xmlns:wpg="http://schemas.microsoft.com/office/word/2010/wordprocessingGroup" xmlns:wpi="http://schemas.microsoft.com/office/word/2010/wordprocessingInk" xmlns:wne="http://schemas.microsoft.com/office/word/2006/wordml" xmlns:wps="http://schemas.microsoft.com/office/word/2010/wordprocessingShape" mc:Ignorable="w14 w15 w16se w16cid w16 w16cex w16sdtdh wp14">
   <w:footnote w:type="separator" w:id="-1">
     <w:p>
       <w:pPr>
@@ -1726,7 +2265,7 @@
 </file>
 
 <file path=word/header1.xml><?xml version="1.0" encoding="utf-8"?>
-<w:hdr xmlns:wpc="http://schemas.microsoft.com/office/word/2010/wordprocessingCanvas" xmlns:cx="http://schemas.microsoft.com/office/drawing/2014/chartex" xmlns:cx1="http://schemas.microsoft.com/office/drawing/2015/9/8/chartex" xmlns:cx2="http://schemas.microsoft.com/office/drawing/2015/10/21/chartex" xmlns:cx3="http://schemas.microsoft.com/office/drawing/2016/5/9/chartex" xmlns:cx4="http://schemas.microsoft.com/office/drawing/2016/5/10/chartex" xmlns:cx5="http://schemas.microsoft.com/office/drawing/2016/5/11/chartex" xmlns:cx6="http://schemas.microsoft.com/office/drawing/2016/5/12/chartex" xmlns:cx7="http://schemas.microsoft.com/office/drawing/2016/5/13/chartex" xmlns:cx8="http://schemas.microsoft.com/office/drawing/2016/5/14/chartex" xmlns:mc="http://schemas.openxmlformats.org/markup-compatibility/2006" xmlns:aink="http://schemas.microsoft.com/office/drawing/2016/ink" xmlns:am3d="http://schemas.microsoft.com/office/drawing/2017/model3d" xmlns:o="urn:schemas-microsoft-com:office:office" xmlns:r="http://schemas.openxmlformats.org/officeDocument/2006/relationships" xmlns:m="http://schemas.openxmlformats.org/officeDocument/2006/math" xmlns:v="urn:schemas-microsoft-com:vml" xmlns:wp14="http://schemas.microsoft.com/office/word/2010/wordprocessingDrawing" xmlns:wp="http://schemas.openxmlformats.org/drawingml/2006/wordprocessingDrawing" xmlns:w10="urn:schemas-microsoft-com:office:word" xmlns:w="http://schemas.openxmlformats.org/wordprocessingml/2006/main" xmlns:w14="http://schemas.microsoft.com/office/word/2010/wordml" xmlns:w15="http://schemas.microsoft.com/office/word/2012/wordml" xmlns:w16cex="http://schemas.microsoft.com/office/word/2018/wordml/cex" xmlns:w16cid="http://schemas.microsoft.com/office/word/2016/wordml/cid" xmlns:w16="http://schemas.microsoft.com/office/word/2018/wordml" xmlns:w16sdtdh="http://schemas.microsoft.com/office/word/2020/wordml/sdtdatahash" xmlns:w16se="http://schemas.microsoft.com/office/word/2015/wordml/symex" xmlns:wpg="http://schemas.microsoft.com/office/word/2010/wordprocessingGroup" xmlns:wpi="http://schemas.microsoft.com/office/word/2010/wordprocessingInk" xmlns:wne="http://schemas.microsoft.com/office/word/2006/wordml" xmlns:wps="http://schemas.microsoft.com/office/word/2010/wordprocessingShape" mc:Ignorable="w14 w15 w16se w16cid w16 w16cex w16sdtdh wp14">
+<w:hdr xmlns:wpc="http://schemas.microsoft.com/office/word/2010/wordprocessingCanvas" xmlns:cx="http://schemas.microsoft.com/office/drawing/2014/chartex" xmlns:cx1="http://schemas.microsoft.com/office/drawing/2015/9/8/chartex" xmlns:cx2="http://schemas.microsoft.com/office/drawing/2015/10/21/chartex" xmlns:cx3="http://schemas.microsoft.com/office/drawing/2016/5/9/chartex" xmlns:cx4="http://schemas.microsoft.com/office/drawing/2016/5/10/chartex" xmlns:cx5="http://schemas.microsoft.com/office/drawing/2016/5/11/chartex" xmlns:cx6="http://schemas.microsoft.com/office/drawing/2016/5/12/chartex" xmlns:cx7="http://schemas.microsoft.com/office/drawing/2016/5/13/chartex" xmlns:cx8="http://schemas.microsoft.com/office/drawing/2016/5/14/chartex" xmlns:mc="http://schemas.openxmlformats.org/markup-compatibility/2006" xmlns:aink="http://schemas.microsoft.com/office/drawing/2016/ink" xmlns:am3d="http://schemas.microsoft.com/office/drawing/2017/model3d" xmlns:o="urn:schemas-microsoft-com:office:office" xmlns:oel="http://schemas.microsoft.com/office/2019/extlst" xmlns:r="http://schemas.openxmlformats.org/officeDocument/2006/relationships" xmlns:m="http://schemas.openxmlformats.org/officeDocument/2006/math" xmlns:v="urn:schemas-microsoft-com:vml" xmlns:wp14="http://schemas.microsoft.com/office/word/2010/wordprocessingDrawing" xmlns:wp="http://schemas.openxmlformats.org/drawingml/2006/wordprocessingDrawing" xmlns:w10="urn:schemas-microsoft-com:office:word" xmlns:w="http://schemas.openxmlformats.org/wordprocessingml/2006/main" xmlns:w14="http://schemas.microsoft.com/office/word/2010/wordml" xmlns:w15="http://schemas.microsoft.com/office/word/2012/wordml" xmlns:w16cex="http://schemas.microsoft.com/office/word/2018/wordml/cex" xmlns:w16cid="http://schemas.microsoft.com/office/word/2016/wordml/cid" xmlns:w16="http://schemas.microsoft.com/office/word/2018/wordml" xmlns:w16sdtdh="http://schemas.microsoft.com/office/word/2020/wordml/sdtdatahash" xmlns:w16se="http://schemas.microsoft.com/office/word/2015/wordml/symex" xmlns:wpg="http://schemas.microsoft.com/office/word/2010/wordprocessingGroup" xmlns:wpi="http://schemas.microsoft.com/office/word/2010/wordprocessingInk" xmlns:wne="http://schemas.microsoft.com/office/word/2006/wordml" xmlns:wps="http://schemas.microsoft.com/office/word/2010/wordprocessingShape" mc:Ignorable="w14 w15 w16se w16cid w16 w16cex w16sdtdh wp14">
   <w:p>
     <w:pPr>
       <w:rPr>
@@ -1804,7 +2343,19 @@
       <w:rPr>
         <w:lang w:val="en-US"/>
       </w:rPr>
-      <w:t xml:space="preserve">Company X – Report </w:t>
+      <w:t xml:space="preserve">Company </w:t>
+    </w:r>
+    <w:r>
+      <w:rPr>
+        <w:lang w:val="en-US"/>
+      </w:rPr>
+      <w:t>ABC</w:t>
+    </w:r>
+    <w:r>
+      <w:rPr>
+        <w:lang w:val="en-US"/>
+      </w:rPr>
+      <w:t xml:space="preserve"> – Report </w:t>
     </w:r>
     <w:r>
       <w:rPr>
@@ -1859,7 +2410,6 @@
       <w:t>Date published: &lt;</w:t>
     </w:r>
     <w:proofErr w:type="spellStart"/>
-    <w:proofErr w:type="gramStart"/>
     <w:r>
       <w:rPr>
         <w:i/>
@@ -1869,7 +2419,6 @@
       <w:t>date:published</w:t>
     </w:r>
     <w:proofErr w:type="spellEnd"/>
-    <w:proofErr w:type="gramEnd"/>
     <w:r>
       <w:rPr>
         <w:i/>
@@ -1891,7 +2440,7 @@
 </file>
 
 <file path=word/header2.xml><?xml version="1.0" encoding="utf-8"?>
-<w:hdr xmlns:wpc="http://schemas.microsoft.com/office/word/2010/wordprocessingCanvas" xmlns:cx="http://schemas.microsoft.com/office/drawing/2014/chartex" xmlns:cx1="http://schemas.microsoft.com/office/drawing/2015/9/8/chartex" xmlns:cx2="http://schemas.microsoft.com/office/drawing/2015/10/21/chartex" xmlns:cx3="http://schemas.microsoft.com/office/drawing/2016/5/9/chartex" xmlns:cx4="http://schemas.microsoft.com/office/drawing/2016/5/10/chartex" xmlns:cx5="http://schemas.microsoft.com/office/drawing/2016/5/11/chartex" xmlns:cx6="http://schemas.microsoft.com/office/drawing/2016/5/12/chartex" xmlns:cx7="http://schemas.microsoft.com/office/drawing/2016/5/13/chartex" xmlns:cx8="http://schemas.microsoft.com/office/drawing/2016/5/14/chartex" xmlns:mc="http://schemas.openxmlformats.org/markup-compatibility/2006" xmlns:aink="http://schemas.microsoft.com/office/drawing/2016/ink" xmlns:am3d="http://schemas.microsoft.com/office/drawing/2017/model3d" xmlns:o="urn:schemas-microsoft-com:office:office" xmlns:r="http://schemas.openxmlformats.org/officeDocument/2006/relationships" xmlns:m="http://schemas.openxmlformats.org/officeDocument/2006/math" xmlns:v="urn:schemas-microsoft-com:vml" xmlns:wp14="http://schemas.microsoft.com/office/word/2010/wordprocessingDrawing" xmlns:wp="http://schemas.openxmlformats.org/drawingml/2006/wordprocessingDrawing" xmlns:w10="urn:schemas-microsoft-com:office:word" xmlns:w="http://schemas.openxmlformats.org/wordprocessingml/2006/main" xmlns:w14="http://schemas.microsoft.com/office/word/2010/wordml" xmlns:w15="http://schemas.microsoft.com/office/word/2012/wordml" xmlns:w16cex="http://schemas.microsoft.com/office/word/2018/wordml/cex" xmlns:w16cid="http://schemas.microsoft.com/office/word/2016/wordml/cid" xmlns:w16="http://schemas.microsoft.com/office/word/2018/wordml" xmlns:w16sdtdh="http://schemas.microsoft.com/office/word/2020/wordml/sdtdatahash" xmlns:w16se="http://schemas.microsoft.com/office/word/2015/wordml/symex" xmlns:wpg="http://schemas.microsoft.com/office/word/2010/wordprocessingGroup" xmlns:wpi="http://schemas.microsoft.com/office/word/2010/wordprocessingInk" xmlns:wne="http://schemas.microsoft.com/office/word/2006/wordml" xmlns:wps="http://schemas.microsoft.com/office/word/2010/wordprocessingShape" mc:Ignorable="w14 w15 w16se w16cid w16 w16cex w16sdtdh wp14">
+<w:hdr xmlns:wpc="http://schemas.microsoft.com/office/word/2010/wordprocessingCanvas" xmlns:cx="http://schemas.microsoft.com/office/drawing/2014/chartex" xmlns:cx1="http://schemas.microsoft.com/office/drawing/2015/9/8/chartex" xmlns:cx2="http://schemas.microsoft.com/office/drawing/2015/10/21/chartex" xmlns:cx3="http://schemas.microsoft.com/office/drawing/2016/5/9/chartex" xmlns:cx4="http://schemas.microsoft.com/office/drawing/2016/5/10/chartex" xmlns:cx5="http://schemas.microsoft.com/office/drawing/2016/5/11/chartex" xmlns:cx6="http://schemas.microsoft.com/office/drawing/2016/5/12/chartex" xmlns:cx7="http://schemas.microsoft.com/office/drawing/2016/5/13/chartex" xmlns:cx8="http://schemas.microsoft.com/office/drawing/2016/5/14/chartex" xmlns:mc="http://schemas.openxmlformats.org/markup-compatibility/2006" xmlns:aink="http://schemas.microsoft.com/office/drawing/2016/ink" xmlns:am3d="http://schemas.microsoft.com/office/drawing/2017/model3d" xmlns:o="urn:schemas-microsoft-com:office:office" xmlns:oel="http://schemas.microsoft.com/office/2019/extlst" xmlns:r="http://schemas.openxmlformats.org/officeDocument/2006/relationships" xmlns:m="http://schemas.openxmlformats.org/officeDocument/2006/math" xmlns:v="urn:schemas-microsoft-com:vml" xmlns:wp14="http://schemas.microsoft.com/office/word/2010/wordprocessingDrawing" xmlns:wp="http://schemas.openxmlformats.org/drawingml/2006/wordprocessingDrawing" xmlns:w10="urn:schemas-microsoft-com:office:word" xmlns:w="http://schemas.openxmlformats.org/wordprocessingml/2006/main" xmlns:w14="http://schemas.microsoft.com/office/word/2010/wordml" xmlns:w15="http://schemas.microsoft.com/office/word/2012/wordml" xmlns:w16cex="http://schemas.microsoft.com/office/word/2018/wordml/cex" xmlns:w16cid="http://schemas.microsoft.com/office/word/2016/wordml/cid" xmlns:w16="http://schemas.microsoft.com/office/word/2018/wordml" xmlns:w16sdtdh="http://schemas.microsoft.com/office/word/2020/wordml/sdtdatahash" xmlns:w16se="http://schemas.microsoft.com/office/word/2015/wordml/symex" xmlns:wpg="http://schemas.microsoft.com/office/word/2010/wordprocessingGroup" xmlns:wpi="http://schemas.microsoft.com/office/word/2010/wordprocessingInk" xmlns:wne="http://schemas.microsoft.com/office/word/2006/wordml" xmlns:wps="http://schemas.microsoft.com/office/word/2010/wordprocessingShape" mc:Ignorable="w14 w15 w16se w16cid w16 w16cex w16sdtdh wp14">
   <w:p>
     <w:pPr>
       <w:pStyle w:val="Header"/>
@@ -1968,7 +2517,19 @@
       <w:rPr>
         <w:lang w:val="en-US"/>
       </w:rPr>
-      <w:t xml:space="preserve">Company X – Report </w:t>
+      <w:t xml:space="preserve">Company </w:t>
+    </w:r>
+    <w:r>
+      <w:rPr>
+        <w:lang w:val="en-US"/>
+      </w:rPr>
+      <w:t>ABC</w:t>
+    </w:r>
+    <w:r>
+      <w:rPr>
+        <w:lang w:val="en-US"/>
+      </w:rPr>
+      <w:t xml:space="preserve"> – Report </w:t>
     </w:r>
     <w:r>
       <w:rPr>
@@ -2019,7 +2580,7 @@
 </file>
 
 <file path=word/numbering.xml><?xml version="1.0" encoding="utf-8"?>
-<w:numbering xmlns:wpc="http://schemas.microsoft.com/office/word/2010/wordprocessingCanvas" xmlns:cx="http://schemas.microsoft.com/office/drawing/2014/chartex" xmlns:cx1="http://schemas.microsoft.com/office/drawing/2015/9/8/chartex" xmlns:cx2="http://schemas.microsoft.com/office/drawing/2015/10/21/chartex" xmlns:cx3="http://schemas.microsoft.com/office/drawing/2016/5/9/chartex" xmlns:cx4="http://schemas.microsoft.com/office/drawing/2016/5/10/chartex" xmlns:cx5="http://schemas.microsoft.com/office/drawing/2016/5/11/chartex" xmlns:cx6="http://schemas.microsoft.com/office/drawing/2016/5/12/chartex" xmlns:cx7="http://schemas.microsoft.com/office/drawing/2016/5/13/chartex" xmlns:cx8="http://schemas.microsoft.com/office/drawing/2016/5/14/chartex" xmlns:mc="http://schemas.openxmlformats.org/markup-compatibility/2006" xmlns:aink="http://schemas.microsoft.com/office/drawing/2016/ink" xmlns:am3d="http://schemas.microsoft.com/office/drawing/2017/model3d" xmlns:o="urn:schemas-microsoft-com:office:office" xmlns:r="http://schemas.openxmlformats.org/officeDocument/2006/relationships" xmlns:m="http://schemas.openxmlformats.org/officeDocument/2006/math" xmlns:v="urn:schemas-microsoft-com:vml" xmlns:wp14="http://schemas.microsoft.com/office/word/2010/wordprocessingDrawing" xmlns:wp="http://schemas.openxmlformats.org/drawingml/2006/wordprocessingDrawing" xmlns:w10="urn:schemas-microsoft-com:office:word" xmlns:w="http://schemas.openxmlformats.org/wordprocessingml/2006/main" xmlns:w14="http://schemas.microsoft.com/office/word/2010/wordml" xmlns:w15="http://schemas.microsoft.com/office/word/2012/wordml" xmlns:w16cex="http://schemas.microsoft.com/office/word/2018/wordml/cex" xmlns:w16cid="http://schemas.microsoft.com/office/word/2016/wordml/cid" xmlns:w16="http://schemas.microsoft.com/office/word/2018/wordml" xmlns:w16sdtdh="http://schemas.microsoft.com/office/word/2020/wordml/sdtdatahash" xmlns:w16se="http://schemas.microsoft.com/office/word/2015/wordml/symex" xmlns:wpg="http://schemas.microsoft.com/office/word/2010/wordprocessingGroup" xmlns:wpi="http://schemas.microsoft.com/office/word/2010/wordprocessingInk" xmlns:wne="http://schemas.microsoft.com/office/word/2006/wordml" xmlns:wps="http://schemas.microsoft.com/office/word/2010/wordprocessingShape" mc:Ignorable="w14 w15 w16se w16cid w16 w16cex w16sdtdh wp14">
+<w:numbering xmlns:wpc="http://schemas.microsoft.com/office/word/2010/wordprocessingCanvas" xmlns:cx="http://schemas.microsoft.com/office/drawing/2014/chartex" xmlns:cx1="http://schemas.microsoft.com/office/drawing/2015/9/8/chartex" xmlns:cx2="http://schemas.microsoft.com/office/drawing/2015/10/21/chartex" xmlns:cx3="http://schemas.microsoft.com/office/drawing/2016/5/9/chartex" xmlns:cx4="http://schemas.microsoft.com/office/drawing/2016/5/10/chartex" xmlns:cx5="http://schemas.microsoft.com/office/drawing/2016/5/11/chartex" xmlns:cx6="http://schemas.microsoft.com/office/drawing/2016/5/12/chartex" xmlns:cx7="http://schemas.microsoft.com/office/drawing/2016/5/13/chartex" xmlns:cx8="http://schemas.microsoft.com/office/drawing/2016/5/14/chartex" xmlns:mc="http://schemas.openxmlformats.org/markup-compatibility/2006" xmlns:aink="http://schemas.microsoft.com/office/drawing/2016/ink" xmlns:am3d="http://schemas.microsoft.com/office/drawing/2017/model3d" xmlns:o="urn:schemas-microsoft-com:office:office" xmlns:oel="http://schemas.microsoft.com/office/2019/extlst" xmlns:r="http://schemas.openxmlformats.org/officeDocument/2006/relationships" xmlns:m="http://schemas.openxmlformats.org/officeDocument/2006/math" xmlns:v="urn:schemas-microsoft-com:vml" xmlns:wp14="http://schemas.microsoft.com/office/word/2010/wordprocessingDrawing" xmlns:wp="http://schemas.openxmlformats.org/drawingml/2006/wordprocessingDrawing" xmlns:w10="urn:schemas-microsoft-com:office:word" xmlns:w="http://schemas.openxmlformats.org/wordprocessingml/2006/main" xmlns:w14="http://schemas.microsoft.com/office/word/2010/wordml" xmlns:w15="http://schemas.microsoft.com/office/word/2012/wordml" xmlns:w16cex="http://schemas.microsoft.com/office/word/2018/wordml/cex" xmlns:w16cid="http://schemas.microsoft.com/office/word/2016/wordml/cid" xmlns:w16="http://schemas.microsoft.com/office/word/2018/wordml" xmlns:w16sdtdh="http://schemas.microsoft.com/office/word/2020/wordml/sdtdatahash" xmlns:w16se="http://schemas.microsoft.com/office/word/2015/wordml/symex" xmlns:wpg="http://schemas.microsoft.com/office/word/2010/wordprocessingGroup" xmlns:wpi="http://schemas.microsoft.com/office/word/2010/wordprocessingInk" xmlns:wne="http://schemas.microsoft.com/office/word/2006/wordml" xmlns:wps="http://schemas.microsoft.com/office/word/2010/wordprocessingShape" mc:Ignorable="w14 w15 w16se w16cid w16 w16cex w16sdtdh wp14">
   <w:abstractNum w:abstractNumId="0" w15:restartNumberingAfterBreak="0">
     <w:nsid w:val="044D276F"/>
     <w:multiLevelType w:val="hybridMultilevel"/>
@@ -2330,13 +2891,13 @@
       </w:rPr>
     </w:lvl>
   </w:abstractNum>
-  <w:num w:numId="1">
+  <w:num w:numId="1" w16cid:durableId="994723094">
     <w:abstractNumId w:val="0"/>
   </w:num>
-  <w:num w:numId="2">
+  <w:num w:numId="2" w16cid:durableId="1173647139">
     <w:abstractNumId w:val="1"/>
   </w:num>
-  <w:num w:numId="3">
+  <w:num w:numId="3" w16cid:durableId="298344137">
     <w:abstractNumId w:val="2"/>
   </w:num>
 </w:numbering>

</xml_diff>